<commit_message>
v2 note: clarify MRI requirement types and optic neuritis exception
Co-Authored-By: Claude Opus 5.5 <noreply@anthropic.com>
Claude-Session: https://claude.ai/code/session_01JWjdjEoTZ38uJSy7UHBC1B
</commit_message>
<xml_diff>
--- a/NMOSD_MOGAD_ADEM_감별진단_학습노트_v2.docx
+++ b/NMOSD_MOGAD_ADEM_감별진단_학습노트_v2.docx
@@ -1894,7 +1894,17 @@
                 <w:sz w:val="18"/>
                 <w:szCs w:val="18"/>
               </w:rPr>
-              <w:t xml:space="preserve"> (→ 2.1.4 표)</w:t>
+              <w:t xml:space="preserve"> (→ 2.1.4 표). </w:t>
+            </w:r>
+            <w:r>
+              <w:rPr>
+                <w:rFonts w:ascii="Malgun Gothic" w:cs="Malgun Gothic" w:eastAsia="Malgun Gothic" w:hAnsi="Malgun Gothic"/>
+                <w:b/>
+                <w:bCs/>
+                <w:sz w:val="18"/>
+                <w:szCs w:val="18"/>
+              </w:rPr>
+              <w:t xml:space="preserve">병변이 꼭 보여야 하는 것은 아님 — 시신경염은 “뇌 MRI 정상”도 충족</w:t>
             </w:r>
           </w:p>
         </w:tc>
@@ -2393,6 +2403,73 @@
           <w:szCs w:val="20"/>
         </w:rPr>
         <w:t xml:space="preserve"> 예) AQP4 양성 환자의 첫 시신경염이 짧은 병변이어도 진단 가능.</w:t>
+      </w:r>
+    </w:p>
+    <w:p>
+      <w:pPr>
+        <w:spacing w:after="100"/>
+      </w:pPr>
+      <w:r>
+        <w:rPr>
+          <w:rFonts w:ascii="Malgun Gothic" w:cs="Malgun Gothic" w:eastAsia="Malgun Gothic" w:hAnsi="Malgun Gothic"/>
+          <w:sz w:val="18"/>
+          <w:szCs w:val="18"/>
+        </w:rPr>
+        <w:t xml:space="preserve">※ 단, </w:t>
+      </w:r>
+      <w:r>
+        <w:rPr>
+          <w:rFonts w:ascii="Malgun Gothic" w:cs="Malgun Gothic" w:eastAsia="Malgun Gothic" w:hAnsi="Malgun Gothic"/>
+          <w:b/>
+          <w:bCs/>
+          <w:sz w:val="18"/>
+          <w:szCs w:val="18"/>
+        </w:rPr>
+        <w:t xml:space="preserve">간뇌 증후군(⑤)·대뇌 증후군(⑥)</w:t>
+      </w:r>
+      <w:r>
+        <w:rPr>
+          <w:rFonts w:ascii="Malgun Gothic" w:cs="Malgun Gothic" w:eastAsia="Malgun Gothic" w:hAnsi="Malgun Gothic"/>
+          <w:sz w:val="18"/>
+          <w:szCs w:val="18"/>
+        </w:rPr>
+        <w:t xml:space="preserve"> 은 정의 문구 자체에 “NMOSD 전형 병변”이 포함되어 있어 </w:t>
+      </w:r>
+      <w:r>
+        <w:rPr>
+          <w:rFonts w:ascii="Malgun Gothic" w:cs="Malgun Gothic" w:eastAsia="Malgun Gothic" w:hAnsi="Malgun Gothic"/>
+          <w:b/>
+          <w:bCs/>
+          <w:sz w:val="18"/>
+          <w:szCs w:val="18"/>
+        </w:rPr>
+        <w:t xml:space="preserve">AQP4 양성이어도 전형 병변이 있어야</w:t>
+      </w:r>
+      <w:r>
+        <w:rPr>
+          <w:rFonts w:ascii="Malgun Gothic" w:cs="Malgun Gothic" w:eastAsia="Malgun Gothic" w:hAnsi="Malgun Gothic"/>
+          <w:sz w:val="18"/>
+          <w:szCs w:val="18"/>
+        </w:rPr>
+        <w:t xml:space="preserve"> core characteristic으로 인정된다. 또한 MRI는 진단 요건이 아니어도 </w:t>
+      </w:r>
+      <w:r>
+        <w:rPr>
+          <w:rFonts w:ascii="Malgun Gothic" w:cs="Malgun Gothic" w:eastAsia="Malgun Gothic" w:hAnsi="Malgun Gothic"/>
+          <w:b/>
+          <w:bCs/>
+          <w:sz w:val="18"/>
+          <w:szCs w:val="18"/>
+        </w:rPr>
+        <w:t xml:space="preserve">대체 진단 배제</w:t>
+      </w:r>
+      <w:r>
+        <w:rPr>
+          <w:rFonts w:ascii="Malgun Gothic" w:cs="Malgun Gothic" w:eastAsia="Malgun Gothic" w:hAnsi="Malgun Gothic"/>
+          <w:sz w:val="18"/>
+          <w:szCs w:val="18"/>
+        </w:rPr>
+        <w:t xml:space="preserve">를 위해 실제로는 필수.</w:t>
       </w:r>
     </w:p>
     <w:p>
@@ -3082,6 +3159,36 @@
               </w:rPr>
               <w:t xml:space="preserve">개수에서 빠짐</w:t>
             </w:r>
+            <w:r>
+              <w:rPr>
+                <w:rFonts w:ascii="Malgun Gothic" w:cs="Malgun Gothic" w:eastAsia="Malgun Gothic" w:hAnsi="Malgun Gothic"/>
+                <w:b w:val="false"/>
+                <w:bCs w:val="false"/>
+                <w:sz w:val="18"/>
+                <w:szCs w:val="18"/>
+              </w:rPr>
+              <w:t xml:space="preserve">. (시신경염은 </w:t>
+            </w:r>
+            <w:r>
+              <w:rPr>
+                <w:rFonts w:ascii="Malgun Gothic" w:cs="Malgun Gothic" w:eastAsia="Malgun Gothic" w:hAnsi="Malgun Gothic"/>
+                <w:b/>
+                <w:bCs/>
+                <w:sz w:val="18"/>
+                <w:szCs w:val="18"/>
+              </w:rPr>
+              <w:t xml:space="preserve">뇌 MRI 정상</w:t>
+            </w:r>
+            <w:r>
+              <w:rPr>
+                <w:rFonts w:ascii="Malgun Gothic" w:cs="Malgun Gothic" w:eastAsia="Malgun Gothic" w:hAnsi="Malgun Gothic"/>
+                <w:b w:val="false"/>
+                <w:bCs w:val="false"/>
+                <w:sz w:val="18"/>
+                <w:szCs w:val="18"/>
+              </w:rPr>
+              <w:t xml:space="preserve">으로도 통과 — 2.1.4 참고)</w:t>
+            </w:r>
           </w:p>
         </w:tc>
       </w:tr>
@@ -3245,7 +3352,7 @@
           <w:sz w:val="20"/>
           <w:szCs w:val="20"/>
         </w:rPr>
-        <w:t xml:space="preserve">인정받기 위한 최소 영상 조건</w:t>
+        <w:t xml:space="preserve">인정받기 위한 MRI 요건</w:t>
       </w:r>
       <w:r>
         <w:rPr>
@@ -3253,7 +3360,1243 @@
           <w:sz w:val="20"/>
           <w:szCs w:val="20"/>
         </w:rPr>
-        <w:t xml:space="preserve">이다.</w:t>
+        <w:t xml:space="preserve">이다. “영상소견(병변)이 있어야 한다”가 아니라 </w:t>
+      </w:r>
+      <w:r>
+        <w:rPr>
+          <w:rFonts w:ascii="Malgun Gothic" w:cs="Malgun Gothic" w:eastAsia="Malgun Gothic" w:hAnsi="Malgun Gothic"/>
+          <w:b/>
+          <w:bCs/>
+          <w:sz w:val="20"/>
+          <w:szCs w:val="20"/>
+        </w:rPr>
+        <w:t xml:space="preserve">“정해진 MRI 요건을 충족해야 한다”</w:t>
+      </w:r>
+      <w:r>
+        <w:rPr>
+          <w:rFonts w:ascii="Malgun Gothic" w:cs="Malgun Gothic" w:eastAsia="Malgun Gothic" w:hAnsi="Malgun Gothic"/>
+          <w:sz w:val="20"/>
+          <w:szCs w:val="20"/>
+        </w:rPr>
+        <w:t xml:space="preserve"> 로 이해해야 하며, 요건은 아래처럼 </w:t>
+      </w:r>
+      <w:r>
+        <w:rPr>
+          <w:rFonts w:ascii="Malgun Gothic" w:cs="Malgun Gothic" w:eastAsia="Malgun Gothic" w:hAnsi="Malgun Gothic"/>
+          <w:b/>
+          <w:bCs/>
+          <w:sz w:val="20"/>
+          <w:szCs w:val="20"/>
+        </w:rPr>
+        <w:t xml:space="preserve">두 종류</w:t>
+      </w:r>
+      <w:r>
+        <w:rPr>
+          <w:rFonts w:ascii="Malgun Gothic" w:cs="Malgun Gothic" w:eastAsia="Malgun Gothic" w:hAnsi="Malgun Gothic"/>
+          <w:sz w:val="20"/>
+          <w:szCs w:val="20"/>
+        </w:rPr>
+        <w:t xml:space="preserve">다.</w:t>
+      </w:r>
+    </w:p>
+    <w:tbl>
+      <w:tblPr>
+        <w:tblW w:type="dxa" w:w="9638"/>
+        <w:tblBorders>
+          <w:top w:val="single" w:color="auto" w:sz="4"/>
+          <w:left w:val="single" w:color="auto" w:sz="4"/>
+          <w:bottom w:val="single" w:color="auto" w:sz="4"/>
+          <w:right w:val="single" w:color="auto" w:sz="4"/>
+          <w:insideH w:val="single" w:color="auto" w:sz="4"/>
+          <w:insideV w:val="single" w:color="auto" w:sz="4"/>
+        </w:tblBorders>
+      </w:tblPr>
+      <w:tblGrid>
+        <w:gridCol w:w="1971"/>
+        <w:gridCol w:w="3942"/>
+        <w:gridCol w:w="3725"/>
+      </w:tblGrid>
+      <w:tr>
+        <w:trPr>
+          <w:tblHeader/>
+        </w:trPr>
+        <w:tc>
+          <w:tcPr>
+            <w:tcW w:type="dxa" w:w="1971"/>
+            <w:tcBorders>
+              <w:top w:val="single" w:color="A6A6A6" w:sz="4"/>
+              <w:left w:val="single" w:color="A6A6A6" w:sz="4"/>
+              <w:bottom w:val="single" w:color="A6A6A6" w:sz="4"/>
+              <w:right w:val="single" w:color="A6A6A6" w:sz="4"/>
+            </w:tcBorders>
+            <w:shd w:fill="D9E2F3" w:color="auto" w:val="clear"/>
+            <w:tcMar>
+              <w:top w:type="dxa" w:w="60"/>
+              <w:left w:type="dxa" w:w="90"/>
+              <w:bottom w:type="dxa" w:w="60"/>
+              <w:right w:type="dxa" w:w="90"/>
+            </w:tcMar>
+            <w:vAlign w:val="center"/>
+          </w:tcPr>
+          <w:p>
+            <w:pPr>
+              <w:spacing w:after="20"/>
+            </w:pPr>
+            <w:r>
+              <w:rPr>
+                <w:rFonts w:ascii="Malgun Gothic" w:cs="Malgun Gothic" w:eastAsia="Malgun Gothic" w:hAnsi="Malgun Gothic"/>
+                <w:b/>
+                <w:bCs/>
+                <w:sz w:val="18"/>
+                <w:szCs w:val="18"/>
+              </w:rPr>
+              <w:t xml:space="preserve">유형</w:t>
+            </w:r>
+          </w:p>
+        </w:tc>
+        <w:tc>
+          <w:tcPr>
+            <w:tcW w:type="dxa" w:w="3942"/>
+            <w:tcBorders>
+              <w:top w:val="single" w:color="A6A6A6" w:sz="4"/>
+              <w:left w:val="single" w:color="A6A6A6" w:sz="4"/>
+              <w:bottom w:val="single" w:color="A6A6A6" w:sz="4"/>
+              <w:right w:val="single" w:color="A6A6A6" w:sz="4"/>
+            </w:tcBorders>
+            <w:shd w:fill="D9E2F3" w:color="auto" w:val="clear"/>
+            <w:tcMar>
+              <w:top w:type="dxa" w:w="60"/>
+              <w:left w:type="dxa" w:w="90"/>
+              <w:bottom w:type="dxa" w:w="60"/>
+              <w:right w:type="dxa" w:w="90"/>
+            </w:tcMar>
+            <w:vAlign w:val="center"/>
+          </w:tcPr>
+          <w:p>
+            <w:pPr>
+              <w:spacing w:after="20"/>
+            </w:pPr>
+            <w:r>
+              <w:rPr>
+                <w:rFonts w:ascii="Malgun Gothic" w:cs="Malgun Gothic" w:eastAsia="Malgun Gothic" w:hAnsi="Malgun Gothic"/>
+                <w:b/>
+                <w:bCs/>
+                <w:sz w:val="18"/>
+                <w:szCs w:val="18"/>
+              </w:rPr>
+              <w:t xml:space="preserve">의미</w:t>
+            </w:r>
+          </w:p>
+        </w:tc>
+        <w:tc>
+          <w:tcPr>
+            <w:tcW w:type="dxa" w:w="3725"/>
+            <w:tcBorders>
+              <w:top w:val="single" w:color="A6A6A6" w:sz="4"/>
+              <w:left w:val="single" w:color="A6A6A6" w:sz="4"/>
+              <w:bottom w:val="single" w:color="A6A6A6" w:sz="4"/>
+              <w:right w:val="single" w:color="A6A6A6" w:sz="4"/>
+            </w:tcBorders>
+            <w:shd w:fill="D9E2F3" w:color="auto" w:val="clear"/>
+            <w:tcMar>
+              <w:top w:type="dxa" w:w="60"/>
+              <w:left w:type="dxa" w:w="90"/>
+              <w:bottom w:type="dxa" w:w="60"/>
+              <w:right w:type="dxa" w:w="90"/>
+            </w:tcMar>
+            <w:vAlign w:val="center"/>
+          </w:tcPr>
+          <w:p>
+            <w:pPr>
+              <w:spacing w:after="20"/>
+            </w:pPr>
+            <w:r>
+              <w:rPr>
+                <w:rFonts w:ascii="Malgun Gothic" w:cs="Malgun Gothic" w:eastAsia="Malgun Gothic" w:hAnsi="Malgun Gothic"/>
+                <w:b/>
+                <w:bCs/>
+                <w:sz w:val="18"/>
+                <w:szCs w:val="18"/>
+              </w:rPr>
+              <w:t xml:space="preserve">해당 core characteristic</w:t>
+            </w:r>
+          </w:p>
+        </w:tc>
+      </w:tr>
+      <w:tr>
+        <w:tc>
+          <w:tcPr>
+            <w:tcW w:type="dxa" w:w="1971"/>
+            <w:tcBorders>
+              <w:top w:val="single" w:color="A6A6A6" w:sz="4"/>
+              <w:left w:val="single" w:color="A6A6A6" w:sz="4"/>
+              <w:bottom w:val="single" w:color="A6A6A6" w:sz="4"/>
+              <w:right w:val="single" w:color="A6A6A6" w:sz="4"/>
+            </w:tcBorders>
+            <w:shd w:fill="F7F7F7" w:color="auto" w:val="clear"/>
+            <w:tcMar>
+              <w:top w:type="dxa" w:w="60"/>
+              <w:left w:type="dxa" w:w="90"/>
+              <w:bottom w:type="dxa" w:w="60"/>
+              <w:right w:type="dxa" w:w="90"/>
+            </w:tcMar>
+            <w:vAlign w:val="center"/>
+          </w:tcPr>
+          <w:p>
+            <w:pPr>
+              <w:spacing w:after="20"/>
+            </w:pPr>
+            <w:r>
+              <w:rPr>
+                <w:rFonts w:ascii="Malgun Gothic" w:cs="Malgun Gothic" w:eastAsia="Malgun Gothic" w:hAnsi="Malgun Gothic"/>
+                <w:b/>
+                <w:bCs/>
+                <w:sz w:val="18"/>
+                <w:szCs w:val="18"/>
+              </w:rPr>
+              <w:t xml:space="preserve">병변 확인형</w:t>
+            </w:r>
+          </w:p>
+        </w:tc>
+        <w:tc>
+          <w:tcPr>
+            <w:tcW w:type="dxa" w:w="3942"/>
+            <w:tcBorders>
+              <w:top w:val="single" w:color="A6A6A6" w:sz="4"/>
+              <w:left w:val="single" w:color="A6A6A6" w:sz="4"/>
+              <w:bottom w:val="single" w:color="A6A6A6" w:sz="4"/>
+              <w:right w:val="single" w:color="A6A6A6" w:sz="4"/>
+            </w:tcBorders>
+            <w:tcMar>
+              <w:top w:type="dxa" w:w="60"/>
+              <w:left w:type="dxa" w:w="90"/>
+              <w:bottom w:type="dxa" w:w="60"/>
+              <w:right w:type="dxa" w:w="90"/>
+            </w:tcMar>
+            <w:vAlign w:val="center"/>
+          </w:tcPr>
+          <w:p>
+            <w:pPr>
+              <w:spacing w:after="20"/>
+            </w:pPr>
+            <w:r>
+              <w:rPr>
+                <w:rFonts w:ascii="Malgun Gothic" w:cs="Malgun Gothic" w:eastAsia="Malgun Gothic" w:hAnsi="Malgun Gothic"/>
+                <w:b w:val="false"/>
+                <w:bCs w:val="false"/>
+                <w:sz w:val="18"/>
+                <w:szCs w:val="18"/>
+              </w:rPr>
+              <w:t xml:space="preserve">해당 부위에 NMOSD형 </w:t>
+            </w:r>
+            <w:r>
+              <w:rPr>
+                <w:rFonts w:ascii="Malgun Gothic" w:cs="Malgun Gothic" w:eastAsia="Malgun Gothic" w:hAnsi="Malgun Gothic"/>
+                <w:b/>
+                <w:bCs/>
+                <w:sz w:val="18"/>
+                <w:szCs w:val="18"/>
+              </w:rPr>
+              <w:t xml:space="preserve">병변이 실제로 보여야</w:t>
+            </w:r>
+            <w:r>
+              <w:rPr>
+                <w:rFonts w:ascii="Malgun Gothic" w:cs="Malgun Gothic" w:eastAsia="Malgun Gothic" w:hAnsi="Malgun Gothic"/>
+                <w:b w:val="false"/>
+                <w:bCs w:val="false"/>
+                <w:sz w:val="18"/>
+                <w:szCs w:val="18"/>
+              </w:rPr>
+              <w:t xml:space="preserve"> 함</w:t>
+            </w:r>
+          </w:p>
+        </w:tc>
+        <w:tc>
+          <w:tcPr>
+            <w:tcW w:type="dxa" w:w="3725"/>
+            <w:tcBorders>
+              <w:top w:val="single" w:color="A6A6A6" w:sz="4"/>
+              <w:left w:val="single" w:color="A6A6A6" w:sz="4"/>
+              <w:bottom w:val="single" w:color="A6A6A6" w:sz="4"/>
+              <w:right w:val="single" w:color="A6A6A6" w:sz="4"/>
+            </w:tcBorders>
+            <w:tcMar>
+              <w:top w:type="dxa" w:w="60"/>
+              <w:left w:type="dxa" w:w="90"/>
+              <w:bottom w:type="dxa" w:w="60"/>
+              <w:right w:type="dxa" w:w="90"/>
+            </w:tcMar>
+            <w:vAlign w:val="center"/>
+          </w:tcPr>
+          <w:p>
+            <w:pPr>
+              <w:spacing w:after="20"/>
+            </w:pPr>
+            <w:r>
+              <w:rPr>
+                <w:rFonts w:ascii="Malgun Gothic" w:cs="Malgun Gothic" w:eastAsia="Malgun Gothic" w:hAnsi="Malgun Gothic"/>
+                <w:b w:val="false"/>
+                <w:bCs w:val="false"/>
+                <w:sz w:val="18"/>
+                <w:szCs w:val="18"/>
+              </w:rPr>
+              <w:t xml:space="preserve">급성 척수염(LETM), area postrema syndrome(연수 배측 병변), 급성 뇌간 증후군(뇌실주위 병변)</w:t>
+            </w:r>
+          </w:p>
+        </w:tc>
+      </w:tr>
+      <w:tr>
+        <w:tc>
+          <w:tcPr>
+            <w:tcW w:type="dxa" w:w="1971"/>
+            <w:tcBorders>
+              <w:top w:val="single" w:color="A6A6A6" w:sz="4"/>
+              <w:left w:val="single" w:color="A6A6A6" w:sz="4"/>
+              <w:bottom w:val="single" w:color="A6A6A6" w:sz="4"/>
+              <w:right w:val="single" w:color="A6A6A6" w:sz="4"/>
+            </w:tcBorders>
+            <w:shd w:fill="F7F7F7" w:color="auto" w:val="clear"/>
+            <w:tcMar>
+              <w:top w:type="dxa" w:w="60"/>
+              <w:left w:type="dxa" w:w="90"/>
+              <w:bottom w:type="dxa" w:w="60"/>
+              <w:right w:type="dxa" w:w="90"/>
+            </w:tcMar>
+            <w:vAlign w:val="center"/>
+          </w:tcPr>
+          <w:p>
+            <w:pPr>
+              <w:spacing w:after="20"/>
+            </w:pPr>
+            <w:r>
+              <w:rPr>
+                <w:rFonts w:ascii="Malgun Gothic" w:cs="Malgun Gothic" w:eastAsia="Malgun Gothic" w:hAnsi="Malgun Gothic"/>
+                <w:b/>
+                <w:bCs/>
+                <w:sz w:val="18"/>
+                <w:szCs w:val="18"/>
+              </w:rPr>
+              <w:t xml:space="preserve">MS 배제형 (택1)</w:t>
+            </w:r>
+          </w:p>
+        </w:tc>
+        <w:tc>
+          <w:tcPr>
+            <w:tcW w:type="dxa" w:w="3942"/>
+            <w:tcBorders>
+              <w:top w:val="single" w:color="A6A6A6" w:sz="4"/>
+              <w:left w:val="single" w:color="A6A6A6" w:sz="4"/>
+              <w:bottom w:val="single" w:color="A6A6A6" w:sz="4"/>
+              <w:right w:val="single" w:color="A6A6A6" w:sz="4"/>
+            </w:tcBorders>
+            <w:tcMar>
+              <w:top w:type="dxa" w:w="60"/>
+              <w:left w:type="dxa" w:w="90"/>
+              <w:bottom w:type="dxa" w:w="60"/>
+              <w:right w:type="dxa" w:w="90"/>
+            </w:tcMar>
+            <w:vAlign w:val="center"/>
+          </w:tcPr>
+          <w:p>
+            <w:pPr>
+              <w:spacing w:after="20"/>
+            </w:pPr>
+            <w:r>
+              <w:rPr>
+                <w:rFonts w:ascii="Malgun Gothic" w:cs="Malgun Gothic" w:eastAsia="Malgun Gothic" w:hAnsi="Malgun Gothic"/>
+                <w:b w:val="false"/>
+                <w:bCs w:val="false"/>
+                <w:sz w:val="18"/>
+                <w:szCs w:val="18"/>
+              </w:rPr>
+              <w:t xml:space="preserve">NMOSD형 병변이 보이거나, </w:t>
+            </w:r>
+            <w:r>
+              <w:rPr>
+                <w:rFonts w:ascii="Malgun Gothic" w:cs="Malgun Gothic" w:eastAsia="Malgun Gothic" w:hAnsi="Malgun Gothic"/>
+                <w:b/>
+                <w:bCs/>
+                <w:sz w:val="18"/>
+                <w:szCs w:val="18"/>
+              </w:rPr>
+              <w:t xml:space="preserve">MS형 뇌 병변이 없음</w:t>
+            </w:r>
+            <w:r>
+              <w:rPr>
+                <w:rFonts w:ascii="Malgun Gothic" w:cs="Malgun Gothic" w:eastAsia="Malgun Gothic" w:hAnsi="Malgun Gothic"/>
+                <w:b w:val="false"/>
+                <w:bCs w:val="false"/>
+                <w:sz w:val="18"/>
+                <w:szCs w:val="18"/>
+              </w:rPr>
+              <w:t xml:space="preserve">을 확인</w:t>
+            </w:r>
+          </w:p>
+        </w:tc>
+        <w:tc>
+          <w:tcPr>
+            <w:tcW w:type="dxa" w:w="3725"/>
+            <w:tcBorders>
+              <w:top w:val="single" w:color="A6A6A6" w:sz="4"/>
+              <w:left w:val="single" w:color="A6A6A6" w:sz="4"/>
+              <w:bottom w:val="single" w:color="A6A6A6" w:sz="4"/>
+              <w:right w:val="single" w:color="A6A6A6" w:sz="4"/>
+            </w:tcBorders>
+            <w:tcMar>
+              <w:top w:type="dxa" w:w="60"/>
+              <w:left w:type="dxa" w:w="90"/>
+              <w:bottom w:type="dxa" w:w="60"/>
+              <w:right w:type="dxa" w:w="90"/>
+            </w:tcMar>
+            <w:vAlign w:val="center"/>
+          </w:tcPr>
+          <w:p>
+            <w:pPr>
+              <w:spacing w:after="20"/>
+            </w:pPr>
+            <w:r>
+              <w:rPr>
+                <w:rFonts w:ascii="Malgun Gothic" w:cs="Malgun Gothic" w:eastAsia="Malgun Gothic" w:hAnsi="Malgun Gothic"/>
+                <w:b/>
+                <w:bCs/>
+                <w:sz w:val="18"/>
+                <w:szCs w:val="18"/>
+              </w:rPr>
+              <w:t xml:space="preserve">시신경염만 해당</w:t>
+            </w:r>
+          </w:p>
+        </w:tc>
+      </w:tr>
+    </w:tbl>
+    <w:p>
+      <w:pPr>
+        <w:pBdr>
+          <w:left w:val="single" w:color="2E75B6" w:sz="18" w:space="6"/>
+        </w:pBdr>
+        <w:shd w:fill="F2F2F2" w:color="auto" w:val="clear"/>
+        <w:spacing w:after="140" w:before="80"/>
+      </w:pPr>
+      <w:r>
+        <w:rPr>
+          <w:rFonts w:ascii="Malgun Gothic" w:cs="Malgun Gothic" w:eastAsia="Malgun Gothic" w:hAnsi="Malgun Gothic"/>
+          <w:b/>
+          <w:bCs/>
+          <w:sz w:val="19"/>
+          <w:szCs w:val="19"/>
+        </w:rPr>
+        <w:t xml:space="preserve">⚠ 시신경염은 다르다 — 꼭 기억할 것</w:t>
+      </w:r>
+    </w:p>
+    <w:p>
+      <w:pPr>
+        <w:pStyle w:val="ListParagraph"/>
+        <w:numPr>
+          <w:ilvl w:val="0"/>
+          <w:numId w:val="2"/>
+        </w:numPr>
+        <w:spacing w:after="40"/>
+      </w:pPr>
+      <w:r>
+        <w:rPr>
+          <w:rFonts w:ascii="Malgun Gothic" w:cs="Malgun Gothic" w:eastAsia="Malgun Gothic" w:hAnsi="Malgun Gothic"/>
+          <w:sz w:val="20"/>
+          <w:szCs w:val="20"/>
+        </w:rPr>
+        <w:t xml:space="preserve">시신경염 자체는 </w:t>
+      </w:r>
+      <w:r>
+        <w:rPr>
+          <w:rFonts w:ascii="Malgun Gothic" w:cs="Malgun Gothic" w:eastAsia="Malgun Gothic" w:hAnsi="Malgun Gothic"/>
+          <w:b/>
+          <w:bCs/>
+          <w:sz w:val="20"/>
+          <w:szCs w:val="20"/>
+        </w:rPr>
+        <w:t xml:space="preserve">임상 진단</w:t>
+      </w:r>
+      <w:r>
+        <w:rPr>
+          <w:rFonts w:ascii="Malgun Gothic" w:cs="Malgun Gothic" w:eastAsia="Malgun Gothic" w:hAnsi="Malgun Gothic"/>
+          <w:sz w:val="20"/>
+          <w:szCs w:val="20"/>
+        </w:rPr>
+        <w:t xml:space="preserve">(시력 저하, 안구운동 시 통증, RAPD 등)이다.</w:t>
+      </w:r>
+    </w:p>
+    <w:p>
+      <w:pPr>
+        <w:pStyle w:val="ListParagraph"/>
+        <w:numPr>
+          <w:ilvl w:val="0"/>
+          <w:numId w:val="2"/>
+        </w:numPr>
+        <w:spacing w:after="40"/>
+      </w:pPr>
+      <w:r>
+        <w:rPr>
+          <w:rFonts w:ascii="Malgun Gothic" w:cs="Malgun Gothic" w:eastAsia="Malgun Gothic" w:hAnsi="Malgun Gothic"/>
+          <w:sz w:val="20"/>
+          <w:szCs w:val="20"/>
+        </w:rPr>
+        <w:t xml:space="preserve">AQP4 음성일 때의 핵심 질문은 “</w:t>
+      </w:r>
+      <w:r>
+        <w:rPr>
+          <w:rFonts w:ascii="Malgun Gothic" w:cs="Malgun Gothic" w:eastAsia="Malgun Gothic" w:hAnsi="Malgun Gothic"/>
+          <w:b/>
+          <w:bCs/>
+          <w:sz w:val="20"/>
+          <w:szCs w:val="20"/>
+        </w:rPr>
+        <w:t xml:space="preserve">이 시신경염이 MS의 시신경염은 아닌가?</w:t>
+      </w:r>
+      <w:r>
+        <w:rPr>
+          <w:rFonts w:ascii="Malgun Gothic" w:cs="Malgun Gothic" w:eastAsia="Malgun Gothic" w:hAnsi="Malgun Gothic"/>
+          <w:sz w:val="20"/>
+          <w:szCs w:val="20"/>
+        </w:rPr>
+        <w:t xml:space="preserve">”이다.</w:t>
+      </w:r>
+    </w:p>
+    <w:p>
+      <w:pPr>
+        <w:pStyle w:val="ListParagraph"/>
+        <w:numPr>
+          <w:ilvl w:val="0"/>
+          <w:numId w:val="2"/>
+        </w:numPr>
+        <w:spacing w:after="40"/>
+      </w:pPr>
+      <w:r>
+        <w:rPr>
+          <w:rFonts w:ascii="Malgun Gothic" w:cs="Malgun Gothic" w:eastAsia="Malgun Gothic" w:hAnsi="Malgun Gothic"/>
+          <w:sz w:val="20"/>
+          <w:szCs w:val="20"/>
+        </w:rPr>
+        <w:t xml:space="preserve">그래서 요건이 (a) </w:t>
+      </w:r>
+      <w:r>
+        <w:rPr>
+          <w:rFonts w:ascii="Malgun Gothic" w:cs="Malgun Gothic" w:eastAsia="Malgun Gothic" w:hAnsi="Malgun Gothic"/>
+          <w:b/>
+          <w:bCs/>
+          <w:sz w:val="20"/>
+          <w:szCs w:val="20"/>
+        </w:rPr>
+        <w:t xml:space="preserve">뇌 MRI 정상 또는 비특이적 백질 병변만</w:t>
+      </w:r>
+      <w:r>
+        <w:rPr>
+          <w:rFonts w:ascii="Malgun Gothic" w:cs="Malgun Gothic" w:eastAsia="Malgun Gothic" w:hAnsi="Malgun Gothic"/>
+          <w:sz w:val="20"/>
+          <w:szCs w:val="20"/>
+        </w:rPr>
+        <w:t xml:space="preserve"> 있음(→ MS형 뇌 병변 없음) </w:t>
+      </w:r>
+      <w:r>
+        <w:rPr>
+          <w:rFonts w:ascii="Malgun Gothic" w:cs="Malgun Gothic" w:eastAsia="Malgun Gothic" w:hAnsi="Malgun Gothic"/>
+          <w:b/>
+          <w:bCs/>
+          <w:sz w:val="20"/>
+          <w:szCs w:val="20"/>
+        </w:rPr>
+        <w:t xml:space="preserve">또는</w:t>
+      </w:r>
+      <w:r>
+        <w:rPr>
+          <w:rFonts w:ascii="Malgun Gothic" w:cs="Malgun Gothic" w:eastAsia="Malgun Gothic" w:hAnsi="Malgun Gothic"/>
+          <w:sz w:val="20"/>
+          <w:szCs w:val="20"/>
+        </w:rPr>
+        <w:t xml:space="preserve"> (b) 시신경 병변 </w:t>
+      </w:r>
+      <w:r>
+        <w:rPr>
+          <w:rFonts w:ascii="Malgun Gothic" w:cs="Malgun Gothic" w:eastAsia="Malgun Gothic" w:hAnsi="Malgun Gothic"/>
+          <w:b/>
+          <w:bCs/>
+          <w:sz w:val="20"/>
+          <w:szCs w:val="20"/>
+        </w:rPr>
+        <w:t xml:space="preserve">&gt;1/2 길이 또는 chiasm 침범</w:t>
+      </w:r>
+      <w:r>
+        <w:rPr>
+          <w:rFonts w:ascii="Malgun Gothic" w:cs="Malgun Gothic" w:eastAsia="Malgun Gothic" w:hAnsi="Malgun Gothic"/>
+          <w:sz w:val="20"/>
+          <w:szCs w:val="20"/>
+        </w:rPr>
+        <w:t xml:space="preserve">(→ NMOSD형 시신경염 형태) 중 하나다.</w:t>
+      </w:r>
+    </w:p>
+    <w:p>
+      <w:pPr>
+        <w:pStyle w:val="ListParagraph"/>
+        <w:numPr>
+          <w:ilvl w:val="0"/>
+          <w:numId w:val="2"/>
+        </w:numPr>
+        <w:spacing w:after="40"/>
+      </w:pPr>
+      <w:r>
+        <w:rPr>
+          <w:rFonts w:ascii="Malgun Gothic" w:cs="Malgun Gothic" w:eastAsia="Malgun Gothic" w:hAnsi="Malgun Gothic"/>
+          <w:sz w:val="20"/>
+          <w:szCs w:val="20"/>
+        </w:rPr>
+        <w:t xml:space="preserve">따라서 </w:t>
+      </w:r>
+      <w:r>
+        <w:rPr>
+          <w:rFonts w:ascii="Malgun Gothic" w:cs="Malgun Gothic" w:eastAsia="Malgun Gothic" w:hAnsi="Malgun Gothic"/>
+          <w:b/>
+          <w:bCs/>
+          <w:sz w:val="20"/>
+          <w:szCs w:val="20"/>
+        </w:rPr>
+        <w:t xml:space="preserve">orbit MRI에서 시신경 병변이 안 보여도(또는 미촬영이어도) 뇌 MRI가 깨끗하면 통과</w:t>
+      </w:r>
+      <w:r>
+        <w:rPr>
+          <w:rFonts w:ascii="Malgun Gothic" w:cs="Malgun Gothic" w:eastAsia="Malgun Gothic" w:hAnsi="Malgun Gothic"/>
+          <w:sz w:val="20"/>
+          <w:szCs w:val="20"/>
+        </w:rPr>
+        <w:t xml:space="preserve">한다.</w:t>
+      </w:r>
+    </w:p>
+    <w:p>
+      <w:pPr>
+        <w:pStyle w:val="ListParagraph"/>
+        <w:numPr>
+          <w:ilvl w:val="0"/>
+          <w:numId w:val="2"/>
+        </w:numPr>
+        <w:spacing w:after="40"/>
+      </w:pPr>
+      <w:r>
+        <w:rPr>
+          <w:rFonts w:ascii="Malgun Gothic" w:cs="Malgun Gothic" w:eastAsia="Malgun Gothic" w:hAnsi="Malgun Gothic"/>
+          <w:sz w:val="20"/>
+          <w:szCs w:val="20"/>
+        </w:rPr>
+        <w:t xml:space="preserve">반대로 </w:t>
+      </w:r>
+      <w:r>
+        <w:rPr>
+          <w:rFonts w:ascii="Malgun Gothic" w:cs="Malgun Gothic" w:eastAsia="Malgun Gothic" w:hAnsi="Malgun Gothic"/>
+          <w:b/>
+          <w:bCs/>
+          <w:sz w:val="20"/>
+          <w:szCs w:val="20"/>
+        </w:rPr>
+        <w:t xml:space="preserve">척수염·APS·뇌간 증후군은 뇌 MRI가 정상이어도 소용없고, 해당 부위 병변이 보여야</w:t>
+      </w:r>
+      <w:r>
+        <w:rPr>
+          <w:rFonts w:ascii="Malgun Gothic" w:cs="Malgun Gothic" w:eastAsia="Malgun Gothic" w:hAnsi="Malgun Gothic"/>
+          <w:sz w:val="20"/>
+          <w:szCs w:val="20"/>
+        </w:rPr>
+        <w:t xml:space="preserve"> 한다.</w:t>
+      </w:r>
+    </w:p>
+    <w:tbl>
+      <w:tblPr>
+        <w:tblW w:type="dxa" w:w="9638"/>
+        <w:tblBorders>
+          <w:top w:val="single" w:color="auto" w:sz="4"/>
+          <w:left w:val="single" w:color="auto" w:sz="4"/>
+          <w:bottom w:val="single" w:color="auto" w:sz="4"/>
+          <w:right w:val="single" w:color="auto" w:sz="4"/>
+          <w:insideH w:val="single" w:color="auto" w:sz="4"/>
+          <w:insideV w:val="single" w:color="auto" w:sz="4"/>
+        </w:tblBorders>
+      </w:tblPr>
+      <w:tblGrid>
+        <w:gridCol w:w="2847"/>
+        <w:gridCol w:w="3066"/>
+        <w:gridCol w:w="3725"/>
+      </w:tblGrid>
+      <w:tr>
+        <w:trPr>
+          <w:tblHeader/>
+        </w:trPr>
+        <w:tc>
+          <w:tcPr>
+            <w:tcW w:type="dxa" w:w="2847"/>
+            <w:tcBorders>
+              <w:top w:val="single" w:color="A6A6A6" w:sz="4"/>
+              <w:left w:val="single" w:color="A6A6A6" w:sz="4"/>
+              <w:bottom w:val="single" w:color="A6A6A6" w:sz="4"/>
+              <w:right w:val="single" w:color="A6A6A6" w:sz="4"/>
+            </w:tcBorders>
+            <w:shd w:fill="D9E2F3" w:color="auto" w:val="clear"/>
+            <w:tcMar>
+              <w:top w:type="dxa" w:w="60"/>
+              <w:left w:type="dxa" w:w="90"/>
+              <w:bottom w:type="dxa" w:w="60"/>
+              <w:right w:type="dxa" w:w="90"/>
+            </w:tcMar>
+            <w:vAlign w:val="center"/>
+          </w:tcPr>
+          <w:p>
+            <w:pPr>
+              <w:spacing w:after="20"/>
+            </w:pPr>
+            <w:r>
+              <w:rPr>
+                <w:rFonts w:ascii="Malgun Gothic" w:cs="Malgun Gothic" w:eastAsia="Malgun Gothic" w:hAnsi="Malgun Gothic"/>
+                <w:b/>
+                <w:bCs/>
+                <w:sz w:val="18"/>
+                <w:szCs w:val="18"/>
+              </w:rPr>
+              <w:t xml:space="preserve">뇌 MRI</w:t>
+            </w:r>
+          </w:p>
+        </w:tc>
+        <w:tc>
+          <w:tcPr>
+            <w:tcW w:type="dxa" w:w="3066"/>
+            <w:tcBorders>
+              <w:top w:val="single" w:color="A6A6A6" w:sz="4"/>
+              <w:left w:val="single" w:color="A6A6A6" w:sz="4"/>
+              <w:bottom w:val="single" w:color="A6A6A6" w:sz="4"/>
+              <w:right w:val="single" w:color="A6A6A6" w:sz="4"/>
+            </w:tcBorders>
+            <w:shd w:fill="D9E2F3" w:color="auto" w:val="clear"/>
+            <w:tcMar>
+              <w:top w:type="dxa" w:w="60"/>
+              <w:left w:type="dxa" w:w="90"/>
+              <w:bottom w:type="dxa" w:w="60"/>
+              <w:right w:type="dxa" w:w="90"/>
+            </w:tcMar>
+            <w:vAlign w:val="center"/>
+          </w:tcPr>
+          <w:p>
+            <w:pPr>
+              <w:spacing w:after="20"/>
+            </w:pPr>
+            <w:r>
+              <w:rPr>
+                <w:rFonts w:ascii="Malgun Gothic" w:cs="Malgun Gothic" w:eastAsia="Malgun Gothic" w:hAnsi="Malgun Gothic"/>
+                <w:b/>
+                <w:bCs/>
+                <w:sz w:val="18"/>
+                <w:szCs w:val="18"/>
+              </w:rPr>
+              <w:t xml:space="preserve">시신경(orbit) MRI</w:t>
+            </w:r>
+          </w:p>
+        </w:tc>
+        <w:tc>
+          <w:tcPr>
+            <w:tcW w:type="dxa" w:w="3725"/>
+            <w:tcBorders>
+              <w:top w:val="single" w:color="A6A6A6" w:sz="4"/>
+              <w:left w:val="single" w:color="A6A6A6" w:sz="4"/>
+              <w:bottom w:val="single" w:color="A6A6A6" w:sz="4"/>
+              <w:right w:val="single" w:color="A6A6A6" w:sz="4"/>
+            </w:tcBorders>
+            <w:shd w:fill="D9E2F3" w:color="auto" w:val="clear"/>
+            <w:tcMar>
+              <w:top w:type="dxa" w:w="60"/>
+              <w:left w:type="dxa" w:w="90"/>
+              <w:bottom w:type="dxa" w:w="60"/>
+              <w:right w:type="dxa" w:w="90"/>
+            </w:tcMar>
+            <w:vAlign w:val="center"/>
+          </w:tcPr>
+          <w:p>
+            <w:pPr>
+              <w:spacing w:after="20"/>
+            </w:pPr>
+            <w:r>
+              <w:rPr>
+                <w:rFonts w:ascii="Malgun Gothic" w:cs="Malgun Gothic" w:eastAsia="Malgun Gothic" w:hAnsi="Malgun Gothic"/>
+                <w:b/>
+                <w:bCs/>
+                <w:sz w:val="18"/>
+                <w:szCs w:val="18"/>
+              </w:rPr>
+              <w:t xml:space="preserve">시신경염 인정? (AQP4 음성)</w:t>
+            </w:r>
+          </w:p>
+        </w:tc>
+      </w:tr>
+      <w:tr>
+        <w:tc>
+          <w:tcPr>
+            <w:tcW w:type="dxa" w:w="2847"/>
+            <w:tcBorders>
+              <w:top w:val="single" w:color="A6A6A6" w:sz="4"/>
+              <w:left w:val="single" w:color="A6A6A6" w:sz="4"/>
+              <w:bottom w:val="single" w:color="A6A6A6" w:sz="4"/>
+              <w:right w:val="single" w:color="A6A6A6" w:sz="4"/>
+            </w:tcBorders>
+            <w:shd w:fill="F7F7F7" w:color="auto" w:val="clear"/>
+            <w:tcMar>
+              <w:top w:type="dxa" w:w="60"/>
+              <w:left w:type="dxa" w:w="90"/>
+              <w:bottom w:type="dxa" w:w="60"/>
+              <w:right w:type="dxa" w:w="90"/>
+            </w:tcMar>
+            <w:vAlign w:val="center"/>
+          </w:tcPr>
+          <w:p>
+            <w:pPr>
+              <w:spacing w:after="20"/>
+            </w:pPr>
+            <w:r>
+              <w:rPr>
+                <w:rFonts w:ascii="Malgun Gothic" w:cs="Malgun Gothic" w:eastAsia="Malgun Gothic" w:hAnsi="Malgun Gothic"/>
+                <w:b/>
+                <w:bCs/>
+                <w:sz w:val="18"/>
+                <w:szCs w:val="18"/>
+              </w:rPr>
+              <w:t xml:space="preserve">정상</w:t>
+            </w:r>
+          </w:p>
+        </w:tc>
+        <w:tc>
+          <w:tcPr>
+            <w:tcW w:type="dxa" w:w="3066"/>
+            <w:tcBorders>
+              <w:top w:val="single" w:color="A6A6A6" w:sz="4"/>
+              <w:left w:val="single" w:color="A6A6A6" w:sz="4"/>
+              <w:bottom w:val="single" w:color="A6A6A6" w:sz="4"/>
+              <w:right w:val="single" w:color="A6A6A6" w:sz="4"/>
+            </w:tcBorders>
+            <w:tcMar>
+              <w:top w:type="dxa" w:w="60"/>
+              <w:left w:type="dxa" w:w="90"/>
+              <w:bottom w:type="dxa" w:w="60"/>
+              <w:right w:type="dxa" w:w="90"/>
+            </w:tcMar>
+            <w:vAlign w:val="center"/>
+          </w:tcPr>
+          <w:p>
+            <w:pPr>
+              <w:spacing w:after="20"/>
+            </w:pPr>
+            <w:r>
+              <w:rPr>
+                <w:rFonts w:ascii="Malgun Gothic" w:cs="Malgun Gothic" w:eastAsia="Malgun Gothic" w:hAnsi="Malgun Gothic"/>
+                <w:b w:val="false"/>
+                <w:bCs w:val="false"/>
+                <w:sz w:val="18"/>
+                <w:szCs w:val="18"/>
+              </w:rPr>
+              <w:t xml:space="preserve">정상 / 미촬영</w:t>
+            </w:r>
+          </w:p>
+        </w:tc>
+        <w:tc>
+          <w:tcPr>
+            <w:tcW w:type="dxa" w:w="3725"/>
+            <w:tcBorders>
+              <w:top w:val="single" w:color="A6A6A6" w:sz="4"/>
+              <w:left w:val="single" w:color="A6A6A6" w:sz="4"/>
+              <w:bottom w:val="single" w:color="A6A6A6" w:sz="4"/>
+              <w:right w:val="single" w:color="A6A6A6" w:sz="4"/>
+            </w:tcBorders>
+            <w:tcMar>
+              <w:top w:type="dxa" w:w="60"/>
+              <w:left w:type="dxa" w:w="90"/>
+              <w:bottom w:type="dxa" w:w="60"/>
+              <w:right w:type="dxa" w:w="90"/>
+            </w:tcMar>
+            <w:vAlign w:val="center"/>
+          </w:tcPr>
+          <w:p>
+            <w:pPr>
+              <w:spacing w:after="20"/>
+            </w:pPr>
+            <w:r>
+              <w:rPr>
+                <w:rFonts w:ascii="Malgun Gothic" w:cs="Malgun Gothic" w:eastAsia="Malgun Gothic" w:hAnsi="Malgun Gothic"/>
+                <w:b/>
+                <w:bCs/>
+                <w:sz w:val="18"/>
+                <w:szCs w:val="18"/>
+              </w:rPr>
+              <w:t xml:space="preserve">인정</w:t>
+            </w:r>
+            <w:r>
+              <w:rPr>
+                <w:rFonts w:ascii="Malgun Gothic" w:cs="Malgun Gothic" w:eastAsia="Malgun Gothic" w:hAnsi="Malgun Gothic"/>
+                <w:b w:val="false"/>
+                <w:bCs w:val="false"/>
+                <w:sz w:val="18"/>
+                <w:szCs w:val="18"/>
+              </w:rPr>
+              <w:t xml:space="preserve"> — (a) 충족</w:t>
+            </w:r>
+          </w:p>
+        </w:tc>
+      </w:tr>
+      <w:tr>
+        <w:tc>
+          <w:tcPr>
+            <w:tcW w:type="dxa" w:w="2847"/>
+            <w:tcBorders>
+              <w:top w:val="single" w:color="A6A6A6" w:sz="4"/>
+              <w:left w:val="single" w:color="A6A6A6" w:sz="4"/>
+              <w:bottom w:val="single" w:color="A6A6A6" w:sz="4"/>
+              <w:right w:val="single" w:color="A6A6A6" w:sz="4"/>
+            </w:tcBorders>
+            <w:shd w:fill="F7F7F7" w:color="auto" w:val="clear"/>
+            <w:tcMar>
+              <w:top w:type="dxa" w:w="60"/>
+              <w:left w:type="dxa" w:w="90"/>
+              <w:bottom w:type="dxa" w:w="60"/>
+              <w:right w:type="dxa" w:w="90"/>
+            </w:tcMar>
+            <w:vAlign w:val="center"/>
+          </w:tcPr>
+          <w:p>
+            <w:pPr>
+              <w:spacing w:after="20"/>
+            </w:pPr>
+            <w:r>
+              <w:rPr>
+                <w:rFonts w:ascii="Malgun Gothic" w:cs="Malgun Gothic" w:eastAsia="Malgun Gothic" w:hAnsi="Malgun Gothic"/>
+                <w:b/>
+                <w:bCs/>
+                <w:sz w:val="18"/>
+                <w:szCs w:val="18"/>
+              </w:rPr>
+              <w:t xml:space="preserve">비특이적 점상 백질 병변</w:t>
+            </w:r>
+          </w:p>
+        </w:tc>
+        <w:tc>
+          <w:tcPr>
+            <w:tcW w:type="dxa" w:w="3066"/>
+            <w:tcBorders>
+              <w:top w:val="single" w:color="A6A6A6" w:sz="4"/>
+              <w:left w:val="single" w:color="A6A6A6" w:sz="4"/>
+              <w:bottom w:val="single" w:color="A6A6A6" w:sz="4"/>
+              <w:right w:val="single" w:color="A6A6A6" w:sz="4"/>
+            </w:tcBorders>
+            <w:tcMar>
+              <w:top w:type="dxa" w:w="60"/>
+              <w:left w:type="dxa" w:w="90"/>
+              <w:bottom w:type="dxa" w:w="60"/>
+              <w:right w:type="dxa" w:w="90"/>
+            </w:tcMar>
+            <w:vAlign w:val="center"/>
+          </w:tcPr>
+          <w:p>
+            <w:pPr>
+              <w:spacing w:after="20"/>
+            </w:pPr>
+            <w:r>
+              <w:rPr>
+                <w:rFonts w:ascii="Malgun Gothic" w:cs="Malgun Gothic" w:eastAsia="Malgun Gothic" w:hAnsi="Malgun Gothic"/>
+                <w:b w:val="false"/>
+                <w:bCs w:val="false"/>
+                <w:sz w:val="18"/>
+                <w:szCs w:val="18"/>
+              </w:rPr>
+              <w:t xml:space="preserve">정상</w:t>
+            </w:r>
+          </w:p>
+        </w:tc>
+        <w:tc>
+          <w:tcPr>
+            <w:tcW w:type="dxa" w:w="3725"/>
+            <w:tcBorders>
+              <w:top w:val="single" w:color="A6A6A6" w:sz="4"/>
+              <w:left w:val="single" w:color="A6A6A6" w:sz="4"/>
+              <w:bottom w:val="single" w:color="A6A6A6" w:sz="4"/>
+              <w:right w:val="single" w:color="A6A6A6" w:sz="4"/>
+            </w:tcBorders>
+            <w:tcMar>
+              <w:top w:type="dxa" w:w="60"/>
+              <w:left w:type="dxa" w:w="90"/>
+              <w:bottom w:type="dxa" w:w="60"/>
+              <w:right w:type="dxa" w:w="90"/>
+            </w:tcMar>
+            <w:vAlign w:val="center"/>
+          </w:tcPr>
+          <w:p>
+            <w:pPr>
+              <w:spacing w:after="20"/>
+            </w:pPr>
+            <w:r>
+              <w:rPr>
+                <w:rFonts w:ascii="Malgun Gothic" w:cs="Malgun Gothic" w:eastAsia="Malgun Gothic" w:hAnsi="Malgun Gothic"/>
+                <w:b/>
+                <w:bCs/>
+                <w:sz w:val="18"/>
+                <w:szCs w:val="18"/>
+              </w:rPr>
+              <w:t xml:space="preserve">인정</w:t>
+            </w:r>
+            <w:r>
+              <w:rPr>
+                <w:rFonts w:ascii="Malgun Gothic" w:cs="Malgun Gothic" w:eastAsia="Malgun Gothic" w:hAnsi="Malgun Gothic"/>
+                <w:b w:val="false"/>
+                <w:bCs w:val="false"/>
+                <w:sz w:val="18"/>
+                <w:szCs w:val="18"/>
+              </w:rPr>
+              <w:t xml:space="preserve"> — (a) 충족</w:t>
+            </w:r>
+          </w:p>
+        </w:tc>
+      </w:tr>
+      <w:tr>
+        <w:tc>
+          <w:tcPr>
+            <w:tcW w:type="dxa" w:w="2847"/>
+            <w:tcBorders>
+              <w:top w:val="single" w:color="A6A6A6" w:sz="4"/>
+              <w:left w:val="single" w:color="A6A6A6" w:sz="4"/>
+              <w:bottom w:val="single" w:color="A6A6A6" w:sz="4"/>
+              <w:right w:val="single" w:color="A6A6A6" w:sz="4"/>
+            </w:tcBorders>
+            <w:shd w:fill="F7F7F7" w:color="auto" w:val="clear"/>
+            <w:tcMar>
+              <w:top w:type="dxa" w:w="60"/>
+              <w:left w:type="dxa" w:w="90"/>
+              <w:bottom w:type="dxa" w:w="60"/>
+              <w:right w:type="dxa" w:w="90"/>
+            </w:tcMar>
+            <w:vAlign w:val="center"/>
+          </w:tcPr>
+          <w:p>
+            <w:pPr>
+              <w:spacing w:after="20"/>
+            </w:pPr>
+            <w:r>
+              <w:rPr>
+                <w:rFonts w:ascii="Malgun Gothic" w:cs="Malgun Gothic" w:eastAsia="Malgun Gothic" w:hAnsi="Malgun Gothic"/>
+                <w:b/>
+                <w:bCs/>
+                <w:sz w:val="18"/>
+                <w:szCs w:val="18"/>
+              </w:rPr>
+              <w:t xml:space="preserve">MS형 병변</w:t>
+            </w:r>
+            <w:r>
+              <w:rPr>
+                <w:rFonts w:ascii="Malgun Gothic" w:cs="Malgun Gothic" w:eastAsia="Malgun Gothic" w:hAnsi="Malgun Gothic"/>
+                <w:b/>
+                <w:bCs/>
+                <w:sz w:val="18"/>
+                <w:szCs w:val="18"/>
+              </w:rPr>
+              <w:t xml:space="preserve"> (Dawson finger 등)</w:t>
+            </w:r>
+          </w:p>
+        </w:tc>
+        <w:tc>
+          <w:tcPr>
+            <w:tcW w:type="dxa" w:w="3066"/>
+            <w:tcBorders>
+              <w:top w:val="single" w:color="A6A6A6" w:sz="4"/>
+              <w:left w:val="single" w:color="A6A6A6" w:sz="4"/>
+              <w:bottom w:val="single" w:color="A6A6A6" w:sz="4"/>
+              <w:right w:val="single" w:color="A6A6A6" w:sz="4"/>
+            </w:tcBorders>
+            <w:tcMar>
+              <w:top w:type="dxa" w:w="60"/>
+              <w:left w:type="dxa" w:w="90"/>
+              <w:bottom w:type="dxa" w:w="60"/>
+              <w:right w:type="dxa" w:w="90"/>
+            </w:tcMar>
+            <w:vAlign w:val="center"/>
+          </w:tcPr>
+          <w:p>
+            <w:pPr>
+              <w:spacing w:after="20"/>
+            </w:pPr>
+            <w:r>
+              <w:rPr>
+                <w:rFonts w:ascii="Malgun Gothic" w:cs="Malgun Gothic" w:eastAsia="Malgun Gothic" w:hAnsi="Malgun Gothic"/>
+                <w:b w:val="false"/>
+                <w:bCs w:val="false"/>
+                <w:sz w:val="18"/>
+                <w:szCs w:val="18"/>
+              </w:rPr>
+              <w:t xml:space="preserve">정상 또는 짧은 병변</w:t>
+            </w:r>
+          </w:p>
+        </w:tc>
+        <w:tc>
+          <w:tcPr>
+            <w:tcW w:type="dxa" w:w="3725"/>
+            <w:tcBorders>
+              <w:top w:val="single" w:color="A6A6A6" w:sz="4"/>
+              <w:left w:val="single" w:color="A6A6A6" w:sz="4"/>
+              <w:bottom w:val="single" w:color="A6A6A6" w:sz="4"/>
+              <w:right w:val="single" w:color="A6A6A6" w:sz="4"/>
+            </w:tcBorders>
+            <w:tcMar>
+              <w:top w:type="dxa" w:w="60"/>
+              <w:left w:type="dxa" w:w="90"/>
+              <w:bottom w:type="dxa" w:w="60"/>
+              <w:right w:type="dxa" w:w="90"/>
+            </w:tcMar>
+            <w:vAlign w:val="center"/>
+          </w:tcPr>
+          <w:p>
+            <w:pPr>
+              <w:spacing w:after="20"/>
+            </w:pPr>
+            <w:r>
+              <w:rPr>
+                <w:rFonts w:ascii="Malgun Gothic" w:cs="Malgun Gothic" w:eastAsia="Malgun Gothic" w:hAnsi="Malgun Gothic"/>
+                <w:b/>
+                <w:bCs/>
+                <w:sz w:val="18"/>
+                <w:szCs w:val="18"/>
+              </w:rPr>
+              <w:t xml:space="preserve">불인정</w:t>
+            </w:r>
+            <w:r>
+              <w:rPr>
+                <w:rFonts w:ascii="Malgun Gothic" w:cs="Malgun Gothic" w:eastAsia="Malgun Gothic" w:hAnsi="Malgun Gothic"/>
+                <w:b w:val="false"/>
+                <w:bCs w:val="false"/>
+                <w:sz w:val="18"/>
+                <w:szCs w:val="18"/>
+              </w:rPr>
+              <w:t xml:space="preserve"> — (a)(b) 모두 미충족</w:t>
+            </w:r>
+          </w:p>
+        </w:tc>
+      </w:tr>
+      <w:tr>
+        <w:tc>
+          <w:tcPr>
+            <w:tcW w:type="dxa" w:w="2847"/>
+            <w:tcBorders>
+              <w:top w:val="single" w:color="A6A6A6" w:sz="4"/>
+              <w:left w:val="single" w:color="A6A6A6" w:sz="4"/>
+              <w:bottom w:val="single" w:color="A6A6A6" w:sz="4"/>
+              <w:right w:val="single" w:color="A6A6A6" w:sz="4"/>
+            </w:tcBorders>
+            <w:shd w:fill="F7F7F7" w:color="auto" w:val="clear"/>
+            <w:tcMar>
+              <w:top w:type="dxa" w:w="60"/>
+              <w:left w:type="dxa" w:w="90"/>
+              <w:bottom w:type="dxa" w:w="60"/>
+              <w:right w:type="dxa" w:w="90"/>
+            </w:tcMar>
+            <w:vAlign w:val="center"/>
+          </w:tcPr>
+          <w:p>
+            <w:pPr>
+              <w:spacing w:after="20"/>
+            </w:pPr>
+            <w:r>
+              <w:rPr>
+                <w:rFonts w:ascii="Malgun Gothic" w:cs="Malgun Gothic" w:eastAsia="Malgun Gothic" w:hAnsi="Malgun Gothic"/>
+                <w:b/>
+                <w:bCs/>
+                <w:sz w:val="18"/>
+                <w:szCs w:val="18"/>
+              </w:rPr>
+              <w:t xml:space="preserve">MS형 병변</w:t>
+            </w:r>
+          </w:p>
+        </w:tc>
+        <w:tc>
+          <w:tcPr>
+            <w:tcW w:type="dxa" w:w="3066"/>
+            <w:tcBorders>
+              <w:top w:val="single" w:color="A6A6A6" w:sz="4"/>
+              <w:left w:val="single" w:color="A6A6A6" w:sz="4"/>
+              <w:bottom w:val="single" w:color="A6A6A6" w:sz="4"/>
+              <w:right w:val="single" w:color="A6A6A6" w:sz="4"/>
+            </w:tcBorders>
+            <w:tcMar>
+              <w:top w:type="dxa" w:w="60"/>
+              <w:left w:type="dxa" w:w="90"/>
+              <w:bottom w:type="dxa" w:w="60"/>
+              <w:right w:type="dxa" w:w="90"/>
+            </w:tcMar>
+            <w:vAlign w:val="center"/>
+          </w:tcPr>
+          <w:p>
+            <w:pPr>
+              <w:spacing w:after="20"/>
+            </w:pPr>
+            <w:r>
+              <w:rPr>
+                <w:rFonts w:ascii="Malgun Gothic" w:cs="Malgun Gothic" w:eastAsia="Malgun Gothic" w:hAnsi="Malgun Gothic"/>
+                <w:b/>
+                <w:bCs/>
+                <w:sz w:val="18"/>
+                <w:szCs w:val="18"/>
+              </w:rPr>
+              <w:t xml:space="preserve">&gt;1/2 길이 또는 chiasm 침범</w:t>
+            </w:r>
+          </w:p>
+        </w:tc>
+        <w:tc>
+          <w:tcPr>
+            <w:tcW w:type="dxa" w:w="3725"/>
+            <w:tcBorders>
+              <w:top w:val="single" w:color="A6A6A6" w:sz="4"/>
+              <w:left w:val="single" w:color="A6A6A6" w:sz="4"/>
+              <w:bottom w:val="single" w:color="A6A6A6" w:sz="4"/>
+              <w:right w:val="single" w:color="A6A6A6" w:sz="4"/>
+            </w:tcBorders>
+            <w:tcMar>
+              <w:top w:type="dxa" w:w="60"/>
+              <w:left w:type="dxa" w:w="90"/>
+              <w:bottom w:type="dxa" w:w="60"/>
+              <w:right w:type="dxa" w:w="90"/>
+            </w:tcMar>
+            <w:vAlign w:val="center"/>
+          </w:tcPr>
+          <w:p>
+            <w:pPr>
+              <w:spacing w:after="20"/>
+            </w:pPr>
+            <w:r>
+              <w:rPr>
+                <w:rFonts w:ascii="Malgun Gothic" w:cs="Malgun Gothic" w:eastAsia="Malgun Gothic" w:hAnsi="Malgun Gothic"/>
+                <w:b/>
+                <w:bCs/>
+                <w:sz w:val="18"/>
+                <w:szCs w:val="18"/>
+              </w:rPr>
+              <w:t xml:space="preserve">인정</w:t>
+            </w:r>
+            <w:r>
+              <w:rPr>
+                <w:rFonts w:ascii="Malgun Gothic" w:cs="Malgun Gothic" w:eastAsia="Malgun Gothic" w:hAnsi="Malgun Gothic"/>
+                <w:b w:val="false"/>
+                <w:bCs w:val="false"/>
+                <w:sz w:val="18"/>
+                <w:szCs w:val="18"/>
+              </w:rPr>
+              <w:t xml:space="preserve"> — (b) 충족 (단, MS 감별은 별도로 필요)</w:t>
+            </w:r>
+          </w:p>
+        </w:tc>
+      </w:tr>
+    </w:tbl>
+    <w:p>
+      <w:pPr>
+        <w:spacing w:after="100"/>
+      </w:pPr>
+      <w:r>
+        <w:rPr>
+          <w:rFonts w:ascii="Malgun Gothic" w:cs="Malgun Gothic" w:eastAsia="Malgun Gothic" w:hAnsi="Malgun Gothic"/>
+          <w:sz w:val="20"/>
+          <w:szCs w:val="20"/>
+        </w:rPr>
+        <w:t xml:space="preserve">아래 표는 core characteristic별 MRI 요건 원문 요지와 판독 포인트이다.</w:t>
       </w:r>
     </w:p>
     <w:tbl>
@@ -7758,7 +9101,245 @@
                 <w:sz w:val="18"/>
                 <w:szCs w:val="18"/>
               </w:rPr>
-              <w:t xml:space="preserve">. 시신경 MRI 정상/미촬영이어도 무관</w:t>
+              <w:t xml:space="preserve">. 시신경 MRI 정상/미촬영이어도 무관. 시신경염의 MRI 요건은 병변 확인이 아니라 </w:t>
+            </w:r>
+            <w:r>
+              <w:rPr>
+                <w:rFonts w:ascii="Malgun Gothic" w:cs="Malgun Gothic" w:eastAsia="Malgun Gothic" w:hAnsi="Malgun Gothic"/>
+                <w:b/>
+                <w:bCs/>
+                <w:sz w:val="18"/>
+                <w:szCs w:val="18"/>
+              </w:rPr>
+              <w:t xml:space="preserve">MS 배제</w:t>
+            </w:r>
+            <w:r>
+              <w:rPr>
+                <w:rFonts w:ascii="Malgun Gothic" w:cs="Malgun Gothic" w:eastAsia="Malgun Gothic" w:hAnsi="Malgun Gothic"/>
+                <w:b w:val="false"/>
+                <w:bCs w:val="false"/>
+                <w:sz w:val="18"/>
+                <w:szCs w:val="18"/>
+              </w:rPr>
+              <w:t xml:space="preserve"> 목적이기 때문</w:t>
+            </w:r>
+          </w:p>
+        </w:tc>
+      </w:tr>
+      <w:tr>
+        <w:tc>
+          <w:tcPr>
+            <w:tcW w:type="dxa" w:w="3285"/>
+            <w:tcBorders>
+              <w:top w:val="single" w:color="A6A6A6" w:sz="4"/>
+              <w:left w:val="single" w:color="A6A6A6" w:sz="4"/>
+              <w:bottom w:val="single" w:color="A6A6A6" w:sz="4"/>
+              <w:right w:val="single" w:color="A6A6A6" w:sz="4"/>
+            </w:tcBorders>
+            <w:shd w:fill="F7F7F7" w:color="auto" w:val="clear"/>
+            <w:tcMar>
+              <w:top w:type="dxa" w:w="60"/>
+              <w:left w:type="dxa" w:w="90"/>
+              <w:bottom w:type="dxa" w:w="60"/>
+              <w:right w:type="dxa" w:w="90"/>
+            </w:tcMar>
+            <w:vAlign w:val="center"/>
+          </w:tcPr>
+          <w:p>
+            <w:pPr>
+              <w:spacing w:after="20"/>
+            </w:pPr>
+            <w:r>
+              <w:rPr>
+                <w:rFonts w:ascii="Malgun Gothic" w:cs="Malgun Gothic" w:eastAsia="Malgun Gothic" w:hAnsi="Malgun Gothic"/>
+                <w:b/>
+                <w:bCs/>
+                <w:sz w:val="18"/>
+                <w:szCs w:val="18"/>
+              </w:rPr>
+              <w:t xml:space="preserve">AQP4 음성이면 영상에서 병변이 꼭 보여야 하나?</w:t>
+            </w:r>
+          </w:p>
+        </w:tc>
+        <w:tc>
+          <w:tcPr>
+            <w:tcW w:type="dxa" w:w="6353"/>
+            <w:tcBorders>
+              <w:top w:val="single" w:color="A6A6A6" w:sz="4"/>
+              <w:left w:val="single" w:color="A6A6A6" w:sz="4"/>
+              <w:bottom w:val="single" w:color="A6A6A6" w:sz="4"/>
+              <w:right w:val="single" w:color="A6A6A6" w:sz="4"/>
+            </w:tcBorders>
+            <w:tcMar>
+              <w:top w:type="dxa" w:w="60"/>
+              <w:left w:type="dxa" w:w="90"/>
+              <w:bottom w:type="dxa" w:w="60"/>
+              <w:right w:type="dxa" w:w="90"/>
+            </w:tcMar>
+            <w:vAlign w:val="center"/>
+          </w:tcPr>
+          <w:p>
+            <w:pPr>
+              <w:spacing w:after="20"/>
+            </w:pPr>
+            <w:r>
+              <w:rPr>
+                <w:rFonts w:ascii="Malgun Gothic" w:cs="Malgun Gothic" w:eastAsia="Malgun Gothic" w:hAnsi="Malgun Gothic"/>
+                <w:b/>
+                <w:bCs/>
+                <w:sz w:val="18"/>
+                <w:szCs w:val="18"/>
+              </w:rPr>
+              <w:t xml:space="preserve">증상에 따라 다름</w:t>
+            </w:r>
+            <w:r>
+              <w:rPr>
+                <w:rFonts w:ascii="Malgun Gothic" w:cs="Malgun Gothic" w:eastAsia="Malgun Gothic" w:hAnsi="Malgun Gothic"/>
+                <w:b w:val="false"/>
+                <w:bCs w:val="false"/>
+                <w:sz w:val="18"/>
+                <w:szCs w:val="18"/>
+              </w:rPr>
+              <w:t xml:space="preserve">. 척수염·APS·뇌간 증후군은 </w:t>
+            </w:r>
+            <w:r>
+              <w:rPr>
+                <w:rFonts w:ascii="Malgun Gothic" w:cs="Malgun Gothic" w:eastAsia="Malgun Gothic" w:hAnsi="Malgun Gothic"/>
+                <w:b/>
+                <w:bCs/>
+                <w:sz w:val="18"/>
+                <w:szCs w:val="18"/>
+              </w:rPr>
+              <w:t xml:space="preserve">병변이 보여야</w:t>
+            </w:r>
+            <w:r>
+              <w:rPr>
+                <w:rFonts w:ascii="Malgun Gothic" w:cs="Malgun Gothic" w:eastAsia="Malgun Gothic" w:hAnsi="Malgun Gothic"/>
+                <w:b w:val="false"/>
+                <w:bCs w:val="false"/>
+                <w:sz w:val="18"/>
+                <w:szCs w:val="18"/>
+              </w:rPr>
+              <w:t xml:space="preserve"> 함. </w:t>
+            </w:r>
+            <w:r>
+              <w:rPr>
+                <w:rFonts w:ascii="Malgun Gothic" w:cs="Malgun Gothic" w:eastAsia="Malgun Gothic" w:hAnsi="Malgun Gothic"/>
+                <w:b/>
+                <w:bCs/>
+                <w:sz w:val="18"/>
+                <w:szCs w:val="18"/>
+              </w:rPr>
+              <w:t xml:space="preserve">시신경염만 예외</w:t>
+            </w:r>
+            <w:r>
+              <w:rPr>
+                <w:rFonts w:ascii="Malgun Gothic" w:cs="Malgun Gothic" w:eastAsia="Malgun Gothic" w:hAnsi="Malgun Gothic"/>
+                <w:b w:val="false"/>
+                <w:bCs w:val="false"/>
+                <w:sz w:val="18"/>
+                <w:szCs w:val="18"/>
+              </w:rPr>
+              <w:t xml:space="preserve"> — 뇌 MRI 정상이어도 충족</w:t>
+            </w:r>
+          </w:p>
+        </w:tc>
+      </w:tr>
+      <w:tr>
+        <w:tc>
+          <w:tcPr>
+            <w:tcW w:type="dxa" w:w="3285"/>
+            <w:tcBorders>
+              <w:top w:val="single" w:color="A6A6A6" w:sz="4"/>
+              <w:left w:val="single" w:color="A6A6A6" w:sz="4"/>
+              <w:bottom w:val="single" w:color="A6A6A6" w:sz="4"/>
+              <w:right w:val="single" w:color="A6A6A6" w:sz="4"/>
+            </w:tcBorders>
+            <w:shd w:fill="F7F7F7" w:color="auto" w:val="clear"/>
+            <w:tcMar>
+              <w:top w:type="dxa" w:w="60"/>
+              <w:left w:type="dxa" w:w="90"/>
+              <w:bottom w:type="dxa" w:w="60"/>
+              <w:right w:type="dxa" w:w="90"/>
+            </w:tcMar>
+            <w:vAlign w:val="center"/>
+          </w:tcPr>
+          <w:p>
+            <w:pPr>
+              <w:spacing w:after="20"/>
+            </w:pPr>
+            <w:r>
+              <w:rPr>
+                <w:rFonts w:ascii="Malgun Gothic" w:cs="Malgun Gothic" w:eastAsia="Malgun Gothic" w:hAnsi="Malgun Gothic"/>
+                <w:b/>
+                <w:bCs/>
+                <w:sz w:val="18"/>
+                <w:szCs w:val="18"/>
+              </w:rPr>
+              <w:t xml:space="preserve">AQP4 양성이면 MRI 없이 임상만으로 되나?</w:t>
+            </w:r>
+          </w:p>
+        </w:tc>
+        <w:tc>
+          <w:tcPr>
+            <w:tcW w:type="dxa" w:w="6353"/>
+            <w:tcBorders>
+              <w:top w:val="single" w:color="A6A6A6" w:sz="4"/>
+              <w:left w:val="single" w:color="A6A6A6" w:sz="4"/>
+              <w:bottom w:val="single" w:color="A6A6A6" w:sz="4"/>
+              <w:right w:val="single" w:color="A6A6A6" w:sz="4"/>
+            </w:tcBorders>
+            <w:tcMar>
+              <w:top w:type="dxa" w:w="60"/>
+              <w:left w:type="dxa" w:w="90"/>
+              <w:bottom w:type="dxa" w:w="60"/>
+              <w:right w:type="dxa" w:w="90"/>
+            </w:tcMar>
+            <w:vAlign w:val="center"/>
+          </w:tcPr>
+          <w:p>
+            <w:pPr>
+              <w:spacing w:after="20"/>
+            </w:pPr>
+            <w:r>
+              <w:rPr>
+                <w:rFonts w:ascii="Malgun Gothic" w:cs="Malgun Gothic" w:eastAsia="Malgun Gothic" w:hAnsi="Malgun Gothic"/>
+                <w:b w:val="false"/>
+                <w:bCs w:val="false"/>
+                <w:sz w:val="18"/>
+                <w:szCs w:val="18"/>
+              </w:rPr>
+              <w:t xml:space="preserve">①~④(ON, 척수염, APS, 뇌간)는 </w:t>
+            </w:r>
+            <w:r>
+              <w:rPr>
+                <w:rFonts w:ascii="Malgun Gothic" w:cs="Malgun Gothic" w:eastAsia="Malgun Gothic" w:hAnsi="Malgun Gothic"/>
+                <w:b/>
+                <w:bCs/>
+                <w:sz w:val="18"/>
+                <w:szCs w:val="18"/>
+              </w:rPr>
+              <w:t xml:space="preserve">임상만으로 인정</w:t>
+            </w:r>
+            <w:r>
+              <w:rPr>
+                <w:rFonts w:ascii="Malgun Gothic" w:cs="Malgun Gothic" w:eastAsia="Malgun Gothic" w:hAnsi="Malgun Gothic"/>
+                <w:b w:val="false"/>
+                <w:bCs w:val="false"/>
+                <w:sz w:val="18"/>
+                <w:szCs w:val="18"/>
+              </w:rPr>
+              <w:t xml:space="preserve">. ⑤⑥(간뇌·대뇌)은 정의상 </w:t>
+            </w:r>
+            <w:r>
+              <w:rPr>
+                <w:rFonts w:ascii="Malgun Gothic" w:cs="Malgun Gothic" w:eastAsia="Malgun Gothic" w:hAnsi="Malgun Gothic"/>
+                <w:b/>
+                <w:bCs/>
+                <w:sz w:val="18"/>
+                <w:szCs w:val="18"/>
+              </w:rPr>
+              <w:t xml:space="preserve">전형 병변 필요</w:t>
             </w:r>
           </w:p>
         </w:tc>

</xml_diff>

<commit_message>
v2 note: add AQP4-positive core characteristic table (MRI-normal cases)
Co-Authored-By: Claude Opus 5.5 <noreply@anthropic.com>
Claude-Session: https://claude.ai/code/session_01JWjdjEoTZ38uJSy7UHBC1B
</commit_message>
<xml_diff>
--- a/NMOSD_MOGAD_ADEM_감별진단_학습노트_v2.docx
+++ b/NMOSD_MOGAD_ADEM_감별진단_학습노트_v2.docx
@@ -2470,6 +2470,902 @@
           <w:szCs w:val="18"/>
         </w:rPr>
         <w:t xml:space="preserve">를 위해 실제로는 필수.</w:t>
+      </w:r>
+    </w:p>
+    <w:tbl>
+      <w:tblPr>
+        <w:tblW w:type="dxa" w:w="9638"/>
+        <w:tblBorders>
+          <w:top w:val="single" w:color="auto" w:sz="4"/>
+          <w:left w:val="single" w:color="auto" w:sz="4"/>
+          <w:bottom w:val="single" w:color="auto" w:sz="4"/>
+          <w:right w:val="single" w:color="auto" w:sz="4"/>
+          <w:insideH w:val="single" w:color="auto" w:sz="4"/>
+          <w:insideV w:val="single" w:color="auto" w:sz="4"/>
+        </w:tblBorders>
+      </w:tblPr>
+      <w:tblGrid>
+        <w:gridCol w:w="2409"/>
+        <w:gridCol w:w="3066"/>
+        <w:gridCol w:w="4163"/>
+      </w:tblGrid>
+      <w:tr>
+        <w:trPr>
+          <w:tblHeader/>
+        </w:trPr>
+        <w:tc>
+          <w:tcPr>
+            <w:tcW w:type="dxa" w:w="2409"/>
+            <w:tcBorders>
+              <w:top w:val="single" w:color="A6A6A6" w:sz="4"/>
+              <w:left w:val="single" w:color="A6A6A6" w:sz="4"/>
+              <w:bottom w:val="single" w:color="A6A6A6" w:sz="4"/>
+              <w:right w:val="single" w:color="A6A6A6" w:sz="4"/>
+            </w:tcBorders>
+            <w:shd w:fill="D9E2F3" w:color="auto" w:val="clear"/>
+            <w:tcMar>
+              <w:top w:type="dxa" w:w="60"/>
+              <w:left w:type="dxa" w:w="90"/>
+              <w:bottom w:type="dxa" w:w="60"/>
+              <w:right w:type="dxa" w:w="90"/>
+            </w:tcMar>
+            <w:vAlign w:val="center"/>
+          </w:tcPr>
+          <w:p>
+            <w:pPr>
+              <w:spacing w:after="20"/>
+            </w:pPr>
+            <w:r>
+              <w:rPr>
+                <w:rFonts w:ascii="Malgun Gothic" w:cs="Malgun Gothic" w:eastAsia="Malgun Gothic" w:hAnsi="Malgun Gothic"/>
+                <w:b/>
+                <w:bCs/>
+                <w:sz w:val="18"/>
+                <w:szCs w:val="18"/>
+              </w:rPr>
+              <w:t xml:space="preserve">Core characteristic</w:t>
+            </w:r>
+          </w:p>
+        </w:tc>
+        <w:tc>
+          <w:tcPr>
+            <w:tcW w:type="dxa" w:w="3066"/>
+            <w:tcBorders>
+              <w:top w:val="single" w:color="A6A6A6" w:sz="4"/>
+              <w:left w:val="single" w:color="A6A6A6" w:sz="4"/>
+              <w:bottom w:val="single" w:color="A6A6A6" w:sz="4"/>
+              <w:right w:val="single" w:color="A6A6A6" w:sz="4"/>
+            </w:tcBorders>
+            <w:shd w:fill="D9E2F3" w:color="auto" w:val="clear"/>
+            <w:tcMar>
+              <w:top w:type="dxa" w:w="60"/>
+              <w:left w:type="dxa" w:w="90"/>
+              <w:bottom w:type="dxa" w:w="60"/>
+              <w:right w:type="dxa" w:w="90"/>
+            </w:tcMar>
+            <w:vAlign w:val="center"/>
+          </w:tcPr>
+          <w:p>
+            <w:pPr>
+              <w:spacing w:after="20"/>
+            </w:pPr>
+            <w:r>
+              <w:rPr>
+                <w:rFonts w:ascii="Malgun Gothic" w:cs="Malgun Gothic" w:eastAsia="Malgun Gothic" w:hAnsi="Malgun Gothic"/>
+                <w:b/>
+                <w:bCs/>
+                <w:sz w:val="18"/>
+                <w:szCs w:val="18"/>
+              </w:rPr>
+              <w:t xml:space="preserve">AQP4 양성: 임상 증상만 있고 MRI 정상이면?</w:t>
+            </w:r>
+          </w:p>
+        </w:tc>
+        <w:tc>
+          <w:tcPr>
+            <w:tcW w:type="dxa" w:w="4163"/>
+            <w:tcBorders>
+              <w:top w:val="single" w:color="A6A6A6" w:sz="4"/>
+              <w:left w:val="single" w:color="A6A6A6" w:sz="4"/>
+              <w:bottom w:val="single" w:color="A6A6A6" w:sz="4"/>
+              <w:right w:val="single" w:color="A6A6A6" w:sz="4"/>
+            </w:tcBorders>
+            <w:shd w:fill="D9E2F3" w:color="auto" w:val="clear"/>
+            <w:tcMar>
+              <w:top w:type="dxa" w:w="60"/>
+              <w:left w:type="dxa" w:w="90"/>
+              <w:bottom w:type="dxa" w:w="60"/>
+              <w:right w:type="dxa" w:w="90"/>
+            </w:tcMar>
+            <w:vAlign w:val="center"/>
+          </w:tcPr>
+          <w:p>
+            <w:pPr>
+              <w:spacing w:after="20"/>
+            </w:pPr>
+            <w:r>
+              <w:rPr>
+                <w:rFonts w:ascii="Malgun Gothic" w:cs="Malgun Gothic" w:eastAsia="Malgun Gothic" w:hAnsi="Malgun Gothic"/>
+                <w:b/>
+                <w:bCs/>
+                <w:sz w:val="18"/>
+                <w:szCs w:val="18"/>
+              </w:rPr>
+              <w:t xml:space="preserve">이유</w:t>
+            </w:r>
+          </w:p>
+        </w:tc>
+      </w:tr>
+      <w:tr>
+        <w:tc>
+          <w:tcPr>
+            <w:tcW w:type="dxa" w:w="2409"/>
+            <w:tcBorders>
+              <w:top w:val="single" w:color="A6A6A6" w:sz="4"/>
+              <w:left w:val="single" w:color="A6A6A6" w:sz="4"/>
+              <w:bottom w:val="single" w:color="A6A6A6" w:sz="4"/>
+              <w:right w:val="single" w:color="A6A6A6" w:sz="4"/>
+            </w:tcBorders>
+            <w:shd w:fill="F7F7F7" w:color="auto" w:val="clear"/>
+            <w:tcMar>
+              <w:top w:type="dxa" w:w="60"/>
+              <w:left w:type="dxa" w:w="90"/>
+              <w:bottom w:type="dxa" w:w="60"/>
+              <w:right w:type="dxa" w:w="90"/>
+            </w:tcMar>
+            <w:vAlign w:val="center"/>
+          </w:tcPr>
+          <w:p>
+            <w:pPr>
+              <w:spacing w:after="20"/>
+            </w:pPr>
+            <w:r>
+              <w:rPr>
+                <w:rFonts w:ascii="Malgun Gothic" w:cs="Malgun Gothic" w:eastAsia="Malgun Gothic" w:hAnsi="Malgun Gothic"/>
+                <w:b/>
+                <w:bCs/>
+                <w:sz w:val="18"/>
+                <w:szCs w:val="18"/>
+              </w:rPr>
+              <w:t xml:space="preserve">① 시신경염</w:t>
+            </w:r>
+          </w:p>
+        </w:tc>
+        <w:tc>
+          <w:tcPr>
+            <w:tcW w:type="dxa" w:w="3066"/>
+            <w:tcBorders>
+              <w:top w:val="single" w:color="A6A6A6" w:sz="4"/>
+              <w:left w:val="single" w:color="A6A6A6" w:sz="4"/>
+              <w:bottom w:val="single" w:color="A6A6A6" w:sz="4"/>
+              <w:right w:val="single" w:color="A6A6A6" w:sz="4"/>
+            </w:tcBorders>
+            <w:tcMar>
+              <w:top w:type="dxa" w:w="60"/>
+              <w:left w:type="dxa" w:w="90"/>
+              <w:bottom w:type="dxa" w:w="60"/>
+              <w:right w:type="dxa" w:w="90"/>
+            </w:tcMar>
+            <w:vAlign w:val="center"/>
+          </w:tcPr>
+          <w:p>
+            <w:pPr>
+              <w:spacing w:after="20"/>
+            </w:pPr>
+            <w:r>
+              <w:rPr>
+                <w:rFonts w:ascii="Malgun Gothic" w:cs="Malgun Gothic" w:eastAsia="Malgun Gothic" w:hAnsi="Malgun Gothic"/>
+                <w:b/>
+                <w:bCs/>
+                <w:sz w:val="18"/>
+                <w:szCs w:val="18"/>
+              </w:rPr>
+              <w:t xml:space="preserve">인정</w:t>
+            </w:r>
+          </w:p>
+        </w:tc>
+        <w:tc>
+          <w:tcPr>
+            <w:tcW w:type="dxa" w:w="4163"/>
+            <w:tcBorders>
+              <w:top w:val="single" w:color="A6A6A6" w:sz="4"/>
+              <w:left w:val="single" w:color="A6A6A6" w:sz="4"/>
+              <w:bottom w:val="single" w:color="A6A6A6" w:sz="4"/>
+              <w:right w:val="single" w:color="A6A6A6" w:sz="4"/>
+            </w:tcBorders>
+            <w:tcMar>
+              <w:top w:type="dxa" w:w="60"/>
+              <w:left w:type="dxa" w:w="90"/>
+              <w:bottom w:type="dxa" w:w="60"/>
+              <w:right w:type="dxa" w:w="90"/>
+            </w:tcMar>
+            <w:vAlign w:val="center"/>
+          </w:tcPr>
+          <w:p>
+            <w:pPr>
+              <w:spacing w:after="20"/>
+            </w:pPr>
+            <w:r>
+              <w:rPr>
+                <w:rFonts w:ascii="Malgun Gothic" w:cs="Malgun Gothic" w:eastAsia="Malgun Gothic" w:hAnsi="Malgun Gothic"/>
+                <w:b w:val="false"/>
+                <w:bCs w:val="false"/>
+                <w:sz w:val="18"/>
+                <w:szCs w:val="18"/>
+              </w:rPr>
+              <w:t xml:space="preserve">추가 MRI 요건 비적용 (시신경염 예외는 </w:t>
+            </w:r>
+            <w:r>
+              <w:rPr>
+                <w:rFonts w:ascii="Malgun Gothic" w:cs="Malgun Gothic" w:eastAsia="Malgun Gothic" w:hAnsi="Malgun Gothic"/>
+                <w:b/>
+                <w:bCs/>
+                <w:sz w:val="18"/>
+                <w:szCs w:val="18"/>
+              </w:rPr>
+              <w:t xml:space="preserve">AQP4 음성 track에만</w:t>
+            </w:r>
+            <w:r>
+              <w:rPr>
+                <w:rFonts w:ascii="Malgun Gothic" w:cs="Malgun Gothic" w:eastAsia="Malgun Gothic" w:hAnsi="Malgun Gothic"/>
+                <w:b w:val="false"/>
+                <w:bCs w:val="false"/>
+                <w:sz w:val="18"/>
+                <w:szCs w:val="18"/>
+              </w:rPr>
+              <w:t xml:space="preserve"> 해당)</w:t>
+            </w:r>
+          </w:p>
+        </w:tc>
+      </w:tr>
+      <w:tr>
+        <w:tc>
+          <w:tcPr>
+            <w:tcW w:type="dxa" w:w="2409"/>
+            <w:tcBorders>
+              <w:top w:val="single" w:color="A6A6A6" w:sz="4"/>
+              <w:left w:val="single" w:color="A6A6A6" w:sz="4"/>
+              <w:bottom w:val="single" w:color="A6A6A6" w:sz="4"/>
+              <w:right w:val="single" w:color="A6A6A6" w:sz="4"/>
+            </w:tcBorders>
+            <w:shd w:fill="F7F7F7" w:color="auto" w:val="clear"/>
+            <w:tcMar>
+              <w:top w:type="dxa" w:w="60"/>
+              <w:left w:type="dxa" w:w="90"/>
+              <w:bottom w:type="dxa" w:w="60"/>
+              <w:right w:type="dxa" w:w="90"/>
+            </w:tcMar>
+            <w:vAlign w:val="center"/>
+          </w:tcPr>
+          <w:p>
+            <w:pPr>
+              <w:spacing w:after="20"/>
+            </w:pPr>
+            <w:r>
+              <w:rPr>
+                <w:rFonts w:ascii="Malgun Gothic" w:cs="Malgun Gothic" w:eastAsia="Malgun Gothic" w:hAnsi="Malgun Gothic"/>
+                <w:b/>
+                <w:bCs/>
+                <w:sz w:val="18"/>
+                <w:szCs w:val="18"/>
+              </w:rPr>
+              <w:t xml:space="preserve">② 급성 척수염</w:t>
+            </w:r>
+          </w:p>
+        </w:tc>
+        <w:tc>
+          <w:tcPr>
+            <w:tcW w:type="dxa" w:w="3066"/>
+            <w:tcBorders>
+              <w:top w:val="single" w:color="A6A6A6" w:sz="4"/>
+              <w:left w:val="single" w:color="A6A6A6" w:sz="4"/>
+              <w:bottom w:val="single" w:color="A6A6A6" w:sz="4"/>
+              <w:right w:val="single" w:color="A6A6A6" w:sz="4"/>
+            </w:tcBorders>
+            <w:tcMar>
+              <w:top w:type="dxa" w:w="60"/>
+              <w:left w:type="dxa" w:w="90"/>
+              <w:bottom w:type="dxa" w:w="60"/>
+              <w:right w:type="dxa" w:w="90"/>
+            </w:tcMar>
+            <w:vAlign w:val="center"/>
+          </w:tcPr>
+          <w:p>
+            <w:pPr>
+              <w:spacing w:after="20"/>
+            </w:pPr>
+            <w:r>
+              <w:rPr>
+                <w:rFonts w:ascii="Malgun Gothic" w:cs="Malgun Gothic" w:eastAsia="Malgun Gothic" w:hAnsi="Malgun Gothic"/>
+                <w:b/>
+                <w:bCs/>
+                <w:sz w:val="18"/>
+                <w:szCs w:val="18"/>
+              </w:rPr>
+              <w:t xml:space="preserve">인정</w:t>
+            </w:r>
+          </w:p>
+        </w:tc>
+        <w:tc>
+          <w:tcPr>
+            <w:tcW w:type="dxa" w:w="4163"/>
+            <w:tcBorders>
+              <w:top w:val="single" w:color="A6A6A6" w:sz="4"/>
+              <w:left w:val="single" w:color="A6A6A6" w:sz="4"/>
+              <w:bottom w:val="single" w:color="A6A6A6" w:sz="4"/>
+              <w:right w:val="single" w:color="A6A6A6" w:sz="4"/>
+            </w:tcBorders>
+            <w:tcMar>
+              <w:top w:type="dxa" w:w="60"/>
+              <w:left w:type="dxa" w:w="90"/>
+              <w:bottom w:type="dxa" w:w="60"/>
+              <w:right w:type="dxa" w:w="90"/>
+            </w:tcMar>
+            <w:vAlign w:val="center"/>
+          </w:tcPr>
+          <w:p>
+            <w:pPr>
+              <w:spacing w:after="20"/>
+            </w:pPr>
+            <w:r>
+              <w:rPr>
+                <w:rFonts w:ascii="Malgun Gothic" w:cs="Malgun Gothic" w:eastAsia="Malgun Gothic" w:hAnsi="Malgun Gothic"/>
+                <w:b w:val="false"/>
+                <w:bCs w:val="false"/>
+                <w:sz w:val="18"/>
+                <w:szCs w:val="18"/>
+              </w:rPr>
+              <w:t xml:space="preserve">추가 MRI 요건 비적용</w:t>
+            </w:r>
+          </w:p>
+        </w:tc>
+      </w:tr>
+      <w:tr>
+        <w:tc>
+          <w:tcPr>
+            <w:tcW w:type="dxa" w:w="2409"/>
+            <w:tcBorders>
+              <w:top w:val="single" w:color="A6A6A6" w:sz="4"/>
+              <w:left w:val="single" w:color="A6A6A6" w:sz="4"/>
+              <w:bottom w:val="single" w:color="A6A6A6" w:sz="4"/>
+              <w:right w:val="single" w:color="A6A6A6" w:sz="4"/>
+            </w:tcBorders>
+            <w:shd w:fill="F7F7F7" w:color="auto" w:val="clear"/>
+            <w:tcMar>
+              <w:top w:type="dxa" w:w="60"/>
+              <w:left w:type="dxa" w:w="90"/>
+              <w:bottom w:type="dxa" w:w="60"/>
+              <w:right w:type="dxa" w:w="90"/>
+            </w:tcMar>
+            <w:vAlign w:val="center"/>
+          </w:tcPr>
+          <w:p>
+            <w:pPr>
+              <w:spacing w:after="20"/>
+            </w:pPr>
+            <w:r>
+              <w:rPr>
+                <w:rFonts w:ascii="Malgun Gothic" w:cs="Malgun Gothic" w:eastAsia="Malgun Gothic" w:hAnsi="Malgun Gothic"/>
+                <w:b/>
+                <w:bCs/>
+                <w:sz w:val="18"/>
+                <w:szCs w:val="18"/>
+              </w:rPr>
+              <w:t xml:space="preserve">③ Area postrema syndrome</w:t>
+            </w:r>
+          </w:p>
+        </w:tc>
+        <w:tc>
+          <w:tcPr>
+            <w:tcW w:type="dxa" w:w="3066"/>
+            <w:tcBorders>
+              <w:top w:val="single" w:color="A6A6A6" w:sz="4"/>
+              <w:left w:val="single" w:color="A6A6A6" w:sz="4"/>
+              <w:bottom w:val="single" w:color="A6A6A6" w:sz="4"/>
+              <w:right w:val="single" w:color="A6A6A6" w:sz="4"/>
+            </w:tcBorders>
+            <w:tcMar>
+              <w:top w:type="dxa" w:w="60"/>
+              <w:left w:type="dxa" w:w="90"/>
+              <w:bottom w:type="dxa" w:w="60"/>
+              <w:right w:type="dxa" w:w="90"/>
+            </w:tcMar>
+            <w:vAlign w:val="center"/>
+          </w:tcPr>
+          <w:p>
+            <w:pPr>
+              <w:spacing w:after="20"/>
+            </w:pPr>
+            <w:r>
+              <w:rPr>
+                <w:rFonts w:ascii="Malgun Gothic" w:cs="Malgun Gothic" w:eastAsia="Malgun Gothic" w:hAnsi="Malgun Gothic"/>
+                <w:b/>
+                <w:bCs/>
+                <w:sz w:val="18"/>
+                <w:szCs w:val="18"/>
+              </w:rPr>
+              <w:t xml:space="preserve">인정</w:t>
+            </w:r>
+          </w:p>
+        </w:tc>
+        <w:tc>
+          <w:tcPr>
+            <w:tcW w:type="dxa" w:w="4163"/>
+            <w:tcBorders>
+              <w:top w:val="single" w:color="A6A6A6" w:sz="4"/>
+              <w:left w:val="single" w:color="A6A6A6" w:sz="4"/>
+              <w:bottom w:val="single" w:color="A6A6A6" w:sz="4"/>
+              <w:right w:val="single" w:color="A6A6A6" w:sz="4"/>
+            </w:tcBorders>
+            <w:tcMar>
+              <w:top w:type="dxa" w:w="60"/>
+              <w:left w:type="dxa" w:w="90"/>
+              <w:bottom w:type="dxa" w:w="60"/>
+              <w:right w:type="dxa" w:w="90"/>
+            </w:tcMar>
+            <w:vAlign w:val="center"/>
+          </w:tcPr>
+          <w:p>
+            <w:pPr>
+              <w:spacing w:after="20"/>
+            </w:pPr>
+            <w:r>
+              <w:rPr>
+                <w:rFonts w:ascii="Malgun Gothic" w:cs="Malgun Gothic" w:eastAsia="Malgun Gothic" w:hAnsi="Malgun Gothic"/>
+                <w:b w:val="false"/>
+                <w:bCs w:val="false"/>
+                <w:sz w:val="18"/>
+                <w:szCs w:val="18"/>
+              </w:rPr>
+              <w:t xml:space="preserve">정의 자체가 임상 증상(달리 설명 안 되는 딸꾹질/오심·구토)</w:t>
+            </w:r>
+          </w:p>
+        </w:tc>
+      </w:tr>
+      <w:tr>
+        <w:tc>
+          <w:tcPr>
+            <w:tcW w:type="dxa" w:w="2409"/>
+            <w:tcBorders>
+              <w:top w:val="single" w:color="A6A6A6" w:sz="4"/>
+              <w:left w:val="single" w:color="A6A6A6" w:sz="4"/>
+              <w:bottom w:val="single" w:color="A6A6A6" w:sz="4"/>
+              <w:right w:val="single" w:color="A6A6A6" w:sz="4"/>
+            </w:tcBorders>
+            <w:shd w:fill="F7F7F7" w:color="auto" w:val="clear"/>
+            <w:tcMar>
+              <w:top w:type="dxa" w:w="60"/>
+              <w:left w:type="dxa" w:w="90"/>
+              <w:bottom w:type="dxa" w:w="60"/>
+              <w:right w:type="dxa" w:w="90"/>
+            </w:tcMar>
+            <w:vAlign w:val="center"/>
+          </w:tcPr>
+          <w:p>
+            <w:pPr>
+              <w:spacing w:after="20"/>
+            </w:pPr>
+            <w:r>
+              <w:rPr>
+                <w:rFonts w:ascii="Malgun Gothic" w:cs="Malgun Gothic" w:eastAsia="Malgun Gothic" w:hAnsi="Malgun Gothic"/>
+                <w:b/>
+                <w:bCs/>
+                <w:sz w:val="18"/>
+                <w:szCs w:val="18"/>
+              </w:rPr>
+              <w:t xml:space="preserve">④ 급성 뇌간 증후군</w:t>
+            </w:r>
+          </w:p>
+        </w:tc>
+        <w:tc>
+          <w:tcPr>
+            <w:tcW w:type="dxa" w:w="3066"/>
+            <w:tcBorders>
+              <w:top w:val="single" w:color="A6A6A6" w:sz="4"/>
+              <w:left w:val="single" w:color="A6A6A6" w:sz="4"/>
+              <w:bottom w:val="single" w:color="A6A6A6" w:sz="4"/>
+              <w:right w:val="single" w:color="A6A6A6" w:sz="4"/>
+            </w:tcBorders>
+            <w:tcMar>
+              <w:top w:type="dxa" w:w="60"/>
+              <w:left w:type="dxa" w:w="90"/>
+              <w:bottom w:type="dxa" w:w="60"/>
+              <w:right w:type="dxa" w:w="90"/>
+            </w:tcMar>
+            <w:vAlign w:val="center"/>
+          </w:tcPr>
+          <w:p>
+            <w:pPr>
+              <w:spacing w:after="20"/>
+            </w:pPr>
+            <w:r>
+              <w:rPr>
+                <w:rFonts w:ascii="Malgun Gothic" w:cs="Malgun Gothic" w:eastAsia="Malgun Gothic" w:hAnsi="Malgun Gothic"/>
+                <w:b/>
+                <w:bCs/>
+                <w:sz w:val="18"/>
+                <w:szCs w:val="18"/>
+              </w:rPr>
+              <w:t xml:space="preserve">인정</w:t>
+            </w:r>
+          </w:p>
+        </w:tc>
+        <w:tc>
+          <w:tcPr>
+            <w:tcW w:type="dxa" w:w="4163"/>
+            <w:tcBorders>
+              <w:top w:val="single" w:color="A6A6A6" w:sz="4"/>
+              <w:left w:val="single" w:color="A6A6A6" w:sz="4"/>
+              <w:bottom w:val="single" w:color="A6A6A6" w:sz="4"/>
+              <w:right w:val="single" w:color="A6A6A6" w:sz="4"/>
+            </w:tcBorders>
+            <w:tcMar>
+              <w:top w:type="dxa" w:w="60"/>
+              <w:left w:type="dxa" w:w="90"/>
+              <w:bottom w:type="dxa" w:w="60"/>
+              <w:right w:type="dxa" w:w="90"/>
+            </w:tcMar>
+            <w:vAlign w:val="center"/>
+          </w:tcPr>
+          <w:p>
+            <w:pPr>
+              <w:spacing w:after="20"/>
+            </w:pPr>
+            <w:r>
+              <w:rPr>
+                <w:rFonts w:ascii="Malgun Gothic" w:cs="Malgun Gothic" w:eastAsia="Malgun Gothic" w:hAnsi="Malgun Gothic"/>
+                <w:b w:val="false"/>
+                <w:bCs w:val="false"/>
+                <w:sz w:val="18"/>
+                <w:szCs w:val="18"/>
+              </w:rPr>
+              <w:t xml:space="preserve">추가 MRI 요건 비적용</w:t>
+            </w:r>
+          </w:p>
+        </w:tc>
+      </w:tr>
+      <w:tr>
+        <w:tc>
+          <w:tcPr>
+            <w:tcW w:type="dxa" w:w="2409"/>
+            <w:tcBorders>
+              <w:top w:val="single" w:color="A6A6A6" w:sz="4"/>
+              <w:left w:val="single" w:color="A6A6A6" w:sz="4"/>
+              <w:bottom w:val="single" w:color="A6A6A6" w:sz="4"/>
+              <w:right w:val="single" w:color="A6A6A6" w:sz="4"/>
+            </w:tcBorders>
+            <w:shd w:fill="F7F7F7" w:color="auto" w:val="clear"/>
+            <w:tcMar>
+              <w:top w:type="dxa" w:w="60"/>
+              <w:left w:type="dxa" w:w="90"/>
+              <w:bottom w:type="dxa" w:w="60"/>
+              <w:right w:type="dxa" w:w="90"/>
+            </w:tcMar>
+            <w:vAlign w:val="center"/>
+          </w:tcPr>
+          <w:p>
+            <w:pPr>
+              <w:spacing w:after="20"/>
+            </w:pPr>
+            <w:r>
+              <w:rPr>
+                <w:rFonts w:ascii="Malgun Gothic" w:cs="Malgun Gothic" w:eastAsia="Malgun Gothic" w:hAnsi="Malgun Gothic"/>
+                <w:b/>
+                <w:bCs/>
+                <w:sz w:val="18"/>
+                <w:szCs w:val="18"/>
+              </w:rPr>
+              <w:t xml:space="preserve">⑤ 간뇌 증후군 / 기면증</w:t>
+            </w:r>
+          </w:p>
+        </w:tc>
+        <w:tc>
+          <w:tcPr>
+            <w:tcW w:type="dxa" w:w="3066"/>
+            <w:tcBorders>
+              <w:top w:val="single" w:color="A6A6A6" w:sz="4"/>
+              <w:left w:val="single" w:color="A6A6A6" w:sz="4"/>
+              <w:bottom w:val="single" w:color="A6A6A6" w:sz="4"/>
+              <w:right w:val="single" w:color="A6A6A6" w:sz="4"/>
+            </w:tcBorders>
+            <w:tcMar>
+              <w:top w:type="dxa" w:w="60"/>
+              <w:left w:type="dxa" w:w="90"/>
+              <w:bottom w:type="dxa" w:w="60"/>
+              <w:right w:type="dxa" w:w="90"/>
+            </w:tcMar>
+            <w:vAlign w:val="center"/>
+          </w:tcPr>
+          <w:p>
+            <w:pPr>
+              <w:spacing w:after="20"/>
+            </w:pPr>
+            <w:r>
+              <w:rPr>
+                <w:rFonts w:ascii="Malgun Gothic" w:cs="Malgun Gothic" w:eastAsia="Malgun Gothic" w:hAnsi="Malgun Gothic"/>
+                <w:b/>
+                <w:bCs/>
+                <w:sz w:val="18"/>
+                <w:szCs w:val="18"/>
+              </w:rPr>
+              <w:t xml:space="preserve">불인정</w:t>
+            </w:r>
+          </w:p>
+        </w:tc>
+        <w:tc>
+          <w:tcPr>
+            <w:tcW w:type="dxa" w:w="4163"/>
+            <w:tcBorders>
+              <w:top w:val="single" w:color="A6A6A6" w:sz="4"/>
+              <w:left w:val="single" w:color="A6A6A6" w:sz="4"/>
+              <w:bottom w:val="single" w:color="A6A6A6" w:sz="4"/>
+              <w:right w:val="single" w:color="A6A6A6" w:sz="4"/>
+            </w:tcBorders>
+            <w:tcMar>
+              <w:top w:type="dxa" w:w="60"/>
+              <w:left w:type="dxa" w:w="90"/>
+              <w:bottom w:type="dxa" w:w="60"/>
+              <w:right w:type="dxa" w:w="90"/>
+            </w:tcMar>
+            <w:vAlign w:val="center"/>
+          </w:tcPr>
+          <w:p>
+            <w:pPr>
+              <w:spacing w:after="20"/>
+            </w:pPr>
+            <w:r>
+              <w:rPr>
+                <w:rFonts w:ascii="Malgun Gothic" w:cs="Malgun Gothic" w:eastAsia="Malgun Gothic" w:hAnsi="Malgun Gothic"/>
+                <w:b w:val="false"/>
+                <w:bCs w:val="false"/>
+                <w:sz w:val="18"/>
+                <w:szCs w:val="18"/>
+              </w:rPr>
+              <w:t xml:space="preserve">정의에 </w:t>
+            </w:r>
+            <w:r>
+              <w:rPr>
+                <w:rFonts w:ascii="Malgun Gothic" w:cs="Malgun Gothic" w:eastAsia="Malgun Gothic" w:hAnsi="Malgun Gothic"/>
+                <w:b/>
+                <w:bCs/>
+                <w:sz w:val="18"/>
+                <w:szCs w:val="18"/>
+              </w:rPr>
+              <w:t xml:space="preserve">“NMOSD 전형 간뇌 MRI 병변”</w:t>
+            </w:r>
+            <w:r>
+              <w:rPr>
+                <w:rFonts w:ascii="Malgun Gothic" w:cs="Malgun Gothic" w:eastAsia="Malgun Gothic" w:hAnsi="Malgun Gothic"/>
+                <w:b w:val="false"/>
+                <w:bCs w:val="false"/>
+                <w:sz w:val="18"/>
+                <w:szCs w:val="18"/>
+              </w:rPr>
+              <w:t xml:space="preserve"> 포함</w:t>
+            </w:r>
+          </w:p>
+        </w:tc>
+      </w:tr>
+      <w:tr>
+        <w:tc>
+          <w:tcPr>
+            <w:tcW w:type="dxa" w:w="2409"/>
+            <w:tcBorders>
+              <w:top w:val="single" w:color="A6A6A6" w:sz="4"/>
+              <w:left w:val="single" w:color="A6A6A6" w:sz="4"/>
+              <w:bottom w:val="single" w:color="A6A6A6" w:sz="4"/>
+              <w:right w:val="single" w:color="A6A6A6" w:sz="4"/>
+            </w:tcBorders>
+            <w:shd w:fill="F7F7F7" w:color="auto" w:val="clear"/>
+            <w:tcMar>
+              <w:top w:type="dxa" w:w="60"/>
+              <w:left w:type="dxa" w:w="90"/>
+              <w:bottom w:type="dxa" w:w="60"/>
+              <w:right w:type="dxa" w:w="90"/>
+            </w:tcMar>
+            <w:vAlign w:val="center"/>
+          </w:tcPr>
+          <w:p>
+            <w:pPr>
+              <w:spacing w:after="20"/>
+            </w:pPr>
+            <w:r>
+              <w:rPr>
+                <w:rFonts w:ascii="Malgun Gothic" w:cs="Malgun Gothic" w:eastAsia="Malgun Gothic" w:hAnsi="Malgun Gothic"/>
+                <w:b/>
+                <w:bCs/>
+                <w:sz w:val="18"/>
+                <w:szCs w:val="18"/>
+              </w:rPr>
+              <w:t xml:space="preserve">⑥ 대뇌 증후군</w:t>
+            </w:r>
+          </w:p>
+        </w:tc>
+        <w:tc>
+          <w:tcPr>
+            <w:tcW w:type="dxa" w:w="3066"/>
+            <w:tcBorders>
+              <w:top w:val="single" w:color="A6A6A6" w:sz="4"/>
+              <w:left w:val="single" w:color="A6A6A6" w:sz="4"/>
+              <w:bottom w:val="single" w:color="A6A6A6" w:sz="4"/>
+              <w:right w:val="single" w:color="A6A6A6" w:sz="4"/>
+            </w:tcBorders>
+            <w:tcMar>
+              <w:top w:type="dxa" w:w="60"/>
+              <w:left w:type="dxa" w:w="90"/>
+              <w:bottom w:type="dxa" w:w="60"/>
+              <w:right w:type="dxa" w:w="90"/>
+            </w:tcMar>
+            <w:vAlign w:val="center"/>
+          </w:tcPr>
+          <w:p>
+            <w:pPr>
+              <w:spacing w:after="20"/>
+            </w:pPr>
+            <w:r>
+              <w:rPr>
+                <w:rFonts w:ascii="Malgun Gothic" w:cs="Malgun Gothic" w:eastAsia="Malgun Gothic" w:hAnsi="Malgun Gothic"/>
+                <w:b/>
+                <w:bCs/>
+                <w:sz w:val="18"/>
+                <w:szCs w:val="18"/>
+              </w:rPr>
+              <w:t xml:space="preserve">불인정</w:t>
+            </w:r>
+          </w:p>
+        </w:tc>
+        <w:tc>
+          <w:tcPr>
+            <w:tcW w:type="dxa" w:w="4163"/>
+            <w:tcBorders>
+              <w:top w:val="single" w:color="A6A6A6" w:sz="4"/>
+              <w:left w:val="single" w:color="A6A6A6" w:sz="4"/>
+              <w:bottom w:val="single" w:color="A6A6A6" w:sz="4"/>
+              <w:right w:val="single" w:color="A6A6A6" w:sz="4"/>
+            </w:tcBorders>
+            <w:tcMar>
+              <w:top w:type="dxa" w:w="60"/>
+              <w:left w:type="dxa" w:w="90"/>
+              <w:bottom w:type="dxa" w:w="60"/>
+              <w:right w:type="dxa" w:w="90"/>
+            </w:tcMar>
+            <w:vAlign w:val="center"/>
+          </w:tcPr>
+          <w:p>
+            <w:pPr>
+              <w:spacing w:after="20"/>
+            </w:pPr>
+            <w:r>
+              <w:rPr>
+                <w:rFonts w:ascii="Malgun Gothic" w:cs="Malgun Gothic" w:eastAsia="Malgun Gothic" w:hAnsi="Malgun Gothic"/>
+                <w:b w:val="false"/>
+                <w:bCs w:val="false"/>
+                <w:sz w:val="18"/>
+                <w:szCs w:val="18"/>
+              </w:rPr>
+              <w:t xml:space="preserve">정의에 </w:t>
+            </w:r>
+            <w:r>
+              <w:rPr>
+                <w:rFonts w:ascii="Malgun Gothic" w:cs="Malgun Gothic" w:eastAsia="Malgun Gothic" w:hAnsi="Malgun Gothic"/>
+                <w:b/>
+                <w:bCs/>
+                <w:sz w:val="18"/>
+                <w:szCs w:val="18"/>
+              </w:rPr>
+              <w:t xml:space="preserve">“NMOSD 전형 뇌 병변”</w:t>
+            </w:r>
+            <w:r>
+              <w:rPr>
+                <w:rFonts w:ascii="Malgun Gothic" w:cs="Malgun Gothic" w:eastAsia="Malgun Gothic" w:hAnsi="Malgun Gothic"/>
+                <w:b w:val="false"/>
+                <w:bCs w:val="false"/>
+                <w:sz w:val="18"/>
+                <w:szCs w:val="18"/>
+              </w:rPr>
+              <w:t xml:space="preserve"> 포함</w:t>
+            </w:r>
+          </w:p>
+        </w:tc>
+      </w:tr>
+    </w:tbl>
+    <w:p>
+      <w:pPr>
+        <w:pBdr>
+          <w:left w:val="single" w:color="2E75B6" w:sz="18" w:space="6"/>
+        </w:pBdr>
+        <w:shd w:fill="F2F2F2" w:color="auto" w:val="clear"/>
+        <w:spacing w:after="140" w:before="80"/>
+      </w:pPr>
+      <w:r>
+        <w:rPr>
+          <w:rFonts w:ascii="Malgun Gothic" w:cs="Malgun Gothic" w:eastAsia="Malgun Gothic" w:hAnsi="Malgun Gothic"/>
+          <w:b/>
+          <w:bCs/>
+          <w:sz w:val="19"/>
+          <w:szCs w:val="19"/>
+        </w:rPr>
+        <w:t xml:space="preserve">실무 주의</w:t>
+      </w:r>
+      <w:r>
+        <w:rPr>
+          <w:rFonts w:ascii="Malgun Gothic" w:cs="Malgun Gothic" w:eastAsia="Malgun Gothic" w:hAnsi="Malgun Gothic"/>
+          <w:sz w:val="19"/>
+          <w:szCs w:val="19"/>
+        </w:rPr>
+        <w:t xml:space="preserve"> — 기준상 ①~④는 MRI 정상이어도 인정되지만, MRI가 정상인 이유를 확인할 것: </w:t>
+      </w:r>
+      <w:r>
+        <w:rPr>
+          <w:rFonts w:ascii="Malgun Gothic" w:cs="Malgun Gothic" w:eastAsia="Malgun Gothic" w:hAnsi="Malgun Gothic"/>
+          <w:b/>
+          <w:bCs/>
+          <w:sz w:val="19"/>
+          <w:szCs w:val="19"/>
+        </w:rPr>
+        <w:t xml:space="preserve">촬영 시기</w:t>
+      </w:r>
+      <w:r>
+        <w:rPr>
+          <w:rFonts w:ascii="Malgun Gothic" w:cs="Malgun Gothic" w:eastAsia="Malgun Gothic" w:hAnsi="Malgun Gothic"/>
+          <w:sz w:val="19"/>
+          <w:szCs w:val="19"/>
+        </w:rPr>
+        <w:t xml:space="preserve">(너무 이르거나 스테로이드 치료 후), </w:t>
+      </w:r>
+      <w:r>
+        <w:rPr>
+          <w:rFonts w:ascii="Malgun Gothic" w:cs="Malgun Gothic" w:eastAsia="Malgun Gothic" w:hAnsi="Malgun Gothic"/>
+          <w:b/>
+          <w:bCs/>
+          <w:sz w:val="19"/>
+          <w:szCs w:val="19"/>
+        </w:rPr>
+        <w:t xml:space="preserve">촬영 범위</w:t>
+      </w:r>
+      <w:r>
+        <w:rPr>
+          <w:rFonts w:ascii="Malgun Gothic" w:cs="Malgun Gothic" w:eastAsia="Malgun Gothic" w:hAnsi="Malgun Gothic"/>
+          <w:sz w:val="19"/>
+          <w:szCs w:val="19"/>
+        </w:rPr>
+        <w:t xml:space="preserve">(예: 척수염인데 경수만 촬영), </w:t>
+      </w:r>
+      <w:r>
+        <w:rPr>
+          <w:rFonts w:ascii="Malgun Gothic" w:cs="Malgun Gothic" w:eastAsia="Malgun Gothic" w:hAnsi="Malgun Gothic"/>
+          <w:b/>
+          <w:bCs/>
+          <w:sz w:val="19"/>
+          <w:szCs w:val="19"/>
+        </w:rPr>
+        <w:t xml:space="preserve">대체 진단 배제</w:t>
+      </w:r>
+      <w:r>
+        <w:rPr>
+          <w:rFonts w:ascii="Malgun Gothic" w:cs="Malgun Gothic" w:eastAsia="Malgun Gothic" w:hAnsi="Malgun Gothic"/>
+          <w:sz w:val="19"/>
+          <w:szCs w:val="19"/>
+        </w:rPr>
+        <w:t xml:space="preserve">(AQP4 양성이어도 필수), </w:t>
+      </w:r>
+      <w:r>
+        <w:rPr>
+          <w:rFonts w:ascii="Malgun Gothic" w:cs="Malgun Gothic" w:eastAsia="Malgun Gothic" w:hAnsi="Malgun Gothic"/>
+          <w:b/>
+          <w:bCs/>
+          <w:sz w:val="19"/>
+          <w:szCs w:val="19"/>
+        </w:rPr>
+        <w:t xml:space="preserve">AQP4-IgG 검사법이 CBA인지</w:t>
+      </w:r>
+      <w:r>
+        <w:rPr>
+          <w:rFonts w:ascii="Malgun Gothic" w:cs="Malgun Gothic" w:eastAsia="Malgun Gothic" w:hAnsi="Malgun Gothic"/>
+          <w:sz w:val="19"/>
+          <w:szCs w:val="19"/>
+        </w:rPr>
+        <w:t xml:space="preserve"> 확인.</w:t>
       </w:r>
     </w:p>
     <w:p>

</xml_diff>